<commit_message>
docs: actualizar todo los documentos a su version repasada
</commit_message>
<xml_diff>
--- a/Documentacion/Planificacion/Planes/PLAN DE GESTIÓN DE COSTES.docx
+++ b/Documentacion/Planificacion/Planes/PLAN DE GESTIÓN DE COSTES.docx
@@ -4,7 +4,7 @@
   <w:body>
     <w:tbl>
       <w:tblPr>
-        <w:tblStyle w:val="Tablaconcuadrcula"/>
+        <w:tblStyle w:val="TableGrid"/>
         <w:tblW w:w="0" w:type="auto"/>
         <w:tblLook w:val="04A0" w:firstRow="1" w:lastRow="0" w:firstColumn="1" w:lastColumn="0" w:noHBand="0" w:noVBand="1"/>
       </w:tblPr>
@@ -210,7 +210,7 @@
     </w:p>
     <w:tbl>
       <w:tblPr>
-        <w:tblStyle w:val="Tablaconcuadrcula"/>
+        <w:tblStyle w:val="TableGrid"/>
         <w:tblW w:w="0" w:type="auto"/>
         <w:tblLook w:val="04A0" w:firstRow="1" w:lastRow="0" w:firstColumn="1" w:lastColumn="0" w:noHBand="0" w:noVBand="1"/>
       </w:tblPr>
@@ -372,7 +372,7 @@
     </w:p>
     <w:tbl>
       <w:tblPr>
-        <w:tblStyle w:val="Tablaconcuadrcula"/>
+        <w:tblStyle w:val="TableGrid"/>
         <w:tblW w:w="0" w:type="auto"/>
         <w:tblLook w:val="04A0" w:firstRow="1" w:lastRow="0" w:firstColumn="1" w:lastColumn="0" w:noHBand="0" w:noVBand="1"/>
       </w:tblPr>
@@ -415,7 +415,7 @@
           </w:tcPr>
           <w:p>
             <w:pPr>
-              <w:pStyle w:val="Prrafodelista"/>
+              <w:pStyle w:val="ListParagraph"/>
               <w:numPr>
                 <w:ilvl w:val="0"/>
                 <w:numId w:val="1"/>
@@ -445,7 +445,7 @@
           </w:p>
           <w:p>
             <w:pPr>
-              <w:pStyle w:val="Prrafodelista"/>
+              <w:pStyle w:val="ListParagraph"/>
               <w:numPr>
                 <w:ilvl w:val="0"/>
                 <w:numId w:val="1"/>
@@ -475,7 +475,7 @@
           </w:p>
           <w:p>
             <w:pPr>
-              <w:pStyle w:val="Prrafodelista"/>
+              <w:pStyle w:val="ListParagraph"/>
               <w:numPr>
                 <w:ilvl w:val="0"/>
                 <w:numId w:val="1"/>
@@ -505,7 +505,7 @@
           </w:p>
           <w:p>
             <w:pPr>
-              <w:pStyle w:val="Prrafodelista"/>
+              <w:pStyle w:val="ListParagraph"/>
               <w:numPr>
                 <w:ilvl w:val="0"/>
                 <w:numId w:val="1"/>
@@ -535,7 +535,7 @@
           </w:p>
           <w:p>
             <w:pPr>
-              <w:pStyle w:val="Prrafodelista"/>
+              <w:pStyle w:val="ListParagraph"/>
               <w:numPr>
                 <w:ilvl w:val="0"/>
                 <w:numId w:val="1"/>
@@ -1374,17 +1374,19 @@
     </w:p>
     <w:tbl>
       <w:tblPr>
-        <w:tblStyle w:val="Tablaconcuadrcula"/>
+        <w:tblStyle w:val="TableGrid"/>
         <w:tblW w:w="0" w:type="auto"/>
         <w:tblLook w:val="04A0" w:firstRow="1" w:lastRow="0" w:firstColumn="1" w:lastColumn="0" w:noHBand="0" w:noVBand="1"/>
       </w:tblPr>
       <w:tblGrid>
-        <w:gridCol w:w="10456"/>
+        <w:gridCol w:w="5228"/>
+        <w:gridCol w:w="5228"/>
       </w:tblGrid>
       <w:tr>
         <w:tc>
           <w:tcPr>
             <w:tcW w:w="10456" w:type="dxa"/>
+            <w:gridSpan w:val="2"/>
             <w:shd w:val="clear" w:color="auto" w:fill="D9D9D9" w:themeFill="background1" w:themeFillShade="D9"/>
           </w:tcPr>
           <w:p>
@@ -1414,6 +1416,7 @@
         <w:tc>
           <w:tcPr>
             <w:tcW w:w="10456" w:type="dxa"/>
+            <w:gridSpan w:val="2"/>
           </w:tcPr>
           <w:p>
             <w:pPr>
@@ -1446,7 +1449,7 @@
           </w:p>
           <w:p>
             <w:pPr>
-              <w:pStyle w:val="Prrafodelista"/>
+              <w:pStyle w:val="ListParagraph"/>
               <w:numPr>
                 <w:ilvl w:val="0"/>
                 <w:numId w:val="2"/>
@@ -1470,7 +1473,7 @@
           </w:p>
           <w:p>
             <w:pPr>
-              <w:pStyle w:val="Prrafodelista"/>
+              <w:pStyle w:val="ListParagraph"/>
               <w:numPr>
                 <w:ilvl w:val="0"/>
                 <w:numId w:val="2"/>
@@ -1552,7 +1555,7 @@
           </w:p>
           <w:p>
             <w:pPr>
-              <w:pStyle w:val="Prrafodelista"/>
+              <w:pStyle w:val="ListParagraph"/>
               <w:numPr>
                 <w:ilvl w:val="0"/>
                 <w:numId w:val="3"/>
@@ -1574,21 +1577,3583 @@
               <w:t>Tiempo: el proyecto debe completarse en el tiempo especificado.</w:t>
             </w:r>
           </w:p>
-          <w:p>
-            <w:pPr>
-              <w:spacing w:after="0" w:line="240" w:lineRule="auto"/>
-              <w:ind w:left="360"/>
-              <w:jc w:val="both"/>
-              <w:rPr>
-                <w:rFonts w:ascii="Tahoma" w:hAnsi="Tahoma" w:cs="Tahoma"/>
-                <w:sz w:val="20"/>
-                <w:szCs w:val="20"/>
-              </w:rPr>
-            </w:pPr>
+        </w:tc>
+      </w:tr>
+      <w:tr>
+        <w:tc>
+          <w:tcPr>
+            <w:tcW w:w="10456" w:type="dxa"/>
+            <w:gridSpan w:val="2"/>
+            <w:shd w:val="clear" w:color="auto" w:fill="D9D9D9" w:themeFill="background1" w:themeFillShade="D9"/>
+          </w:tcPr>
+          <w:p>
+            <w:pPr>
+              <w:spacing w:after="0" w:afterAutospacing="0"/>
+              <w:jc w:val="both"/>
+              <w:rPr>
+                <w:rFonts w:ascii="Tahoma" w:hAnsi="Tahoma" w:cs="Tahoma"/>
+                <w:b/>
+                <w:sz w:val="20"/>
+                <w:szCs w:val="20"/>
+              </w:rPr>
+            </w:pPr>
+            <w:r>
+              <w:rPr>
+                <w:rFonts w:ascii="Tahoma" w:hAnsi="Tahoma" w:cs="Tahoma"/>
+                <w:b/>
+                <w:sz w:val="20"/>
+                <w:szCs w:val="20"/>
+              </w:rPr>
+              <w:t>TABLA DE COSTES</w:t>
+            </w:r>
+            <w:r>
+              <w:rPr>
+                <w:rFonts w:ascii="Tahoma" w:hAnsi="Tahoma" w:cs="Tahoma"/>
+                <w:b/>
+                <w:sz w:val="20"/>
+                <w:szCs w:val="20"/>
+              </w:rPr>
+              <w:t xml:space="preserve"> POR PAQUETE DE TRABAJO</w:t>
+            </w:r>
+          </w:p>
+        </w:tc>
+      </w:tr>
+      <w:tr>
+        <w:tc>
+          <w:tcPr>
+            <w:tcW w:w="5228" w:type="dxa"/>
+            <w:shd w:val="clear" w:color="auto" w:fill="D9D9D9" w:themeFill="background1" w:themeFillShade="D9"/>
+          </w:tcPr>
+          <w:p>
+            <w:pPr>
+              <w:spacing w:after="0" w:afterAutospacing="0"/>
+              <w:jc w:val="both"/>
+              <w:rPr>
+                <w:rFonts w:ascii="Tahoma" w:hAnsi="Tahoma" w:cs="Tahoma"/>
+                <w:b/>
+                <w:sz w:val="20"/>
+                <w:szCs w:val="20"/>
+              </w:rPr>
+            </w:pPr>
+            <w:r>
+              <w:rPr>
+                <w:rFonts w:ascii="Tahoma" w:hAnsi="Tahoma" w:cs="Tahoma"/>
+                <w:b/>
+                <w:sz w:val="20"/>
+                <w:szCs w:val="20"/>
+              </w:rPr>
+              <w:t>PAQUETE</w:t>
+            </w:r>
+            <w:r>
+              <w:rPr>
+                <w:rFonts w:ascii="Tahoma" w:hAnsi="Tahoma" w:cs="Tahoma"/>
+                <w:b/>
+                <w:sz w:val="20"/>
+                <w:szCs w:val="20"/>
+              </w:rPr>
+              <w:t xml:space="preserve"> DE TRABAJO</w:t>
+            </w:r>
+          </w:p>
+        </w:tc>
+        <w:tc>
+          <w:tcPr>
+            <w:tcW w:w="5228" w:type="dxa"/>
+            <w:shd w:val="clear" w:color="auto" w:fill="D9D9D9" w:themeFill="background1" w:themeFillShade="D9"/>
+          </w:tcPr>
+          <w:p>
+            <w:pPr>
+              <w:spacing w:after="0" w:afterAutospacing="0"/>
+              <w:jc w:val="both"/>
+              <w:rPr>
+                <w:rFonts w:ascii="Tahoma" w:hAnsi="Tahoma" w:cs="Tahoma"/>
+                <w:b/>
+                <w:sz w:val="20"/>
+                <w:szCs w:val="20"/>
+              </w:rPr>
+            </w:pPr>
+            <w:r>
+              <w:rPr>
+                <w:rFonts w:ascii="Tahoma" w:hAnsi="Tahoma" w:cs="Tahoma"/>
+                <w:b/>
+                <w:sz w:val="20"/>
+                <w:szCs w:val="20"/>
+              </w:rPr>
+              <w:t>COSTE TOTAL</w:t>
+            </w:r>
+          </w:p>
+        </w:tc>
+      </w:tr>
+      <w:tr>
+        <w:tc>
+          <w:tcPr>
+            <w:tcW w:w="5228" w:type="dxa"/>
+          </w:tcPr>
+          <w:p>
+            <w:pPr>
+              <w:spacing w:after="0" w:afterAutospacing="0"/>
+              <w:jc w:val="both"/>
+              <w:rPr>
+                <w:rFonts w:ascii="Tahoma" w:hAnsi="Tahoma" w:cs="Tahoma"/>
+                <w:bCs/>
+                <w:sz w:val="20"/>
+                <w:szCs w:val="20"/>
+              </w:rPr>
+            </w:pPr>
+            <w:r>
+              <w:rPr>
+                <w:rFonts w:ascii="Tahoma" w:hAnsi="Tahoma" w:cs="Tahoma"/>
+                <w:bCs/>
+                <w:sz w:val="20"/>
+                <w:szCs w:val="20"/>
+              </w:rPr>
+              <w:t>1.1.1: GDD</w:t>
+            </w:r>
+          </w:p>
+        </w:tc>
+        <w:tc>
+          <w:tcPr>
+            <w:tcW w:w="5228" w:type="dxa"/>
+          </w:tcPr>
+          <w:p>
+            <w:pPr>
+              <w:spacing w:after="0" w:afterAutospacing="0"/>
+              <w:jc w:val="both"/>
+              <w:rPr>
+                <w:rFonts w:ascii="Tahoma" w:hAnsi="Tahoma" w:cs="Tahoma"/>
+                <w:bCs/>
+                <w:sz w:val="20"/>
+                <w:szCs w:val="20"/>
+              </w:rPr>
+            </w:pPr>
+            <w:r>
+              <w:rPr>
+                <w:rFonts w:ascii="Tahoma" w:hAnsi="Tahoma" w:cs="Tahoma"/>
+                <w:bCs/>
+                <w:sz w:val="20"/>
+                <w:szCs w:val="20"/>
+              </w:rPr>
+              <w:t>1.050€</w:t>
+            </w:r>
+          </w:p>
+        </w:tc>
+      </w:tr>
+      <w:tr>
+        <w:tc>
+          <w:tcPr>
+            <w:tcW w:w="5228" w:type="dxa"/>
+          </w:tcPr>
+          <w:p>
+            <w:pPr>
+              <w:spacing w:after="0" w:afterAutospacing="0"/>
+              <w:jc w:val="both"/>
+              <w:rPr>
+                <w:rFonts w:ascii="Tahoma" w:hAnsi="Tahoma" w:cs="Tahoma"/>
+                <w:bCs/>
+                <w:sz w:val="20"/>
+                <w:szCs w:val="20"/>
+              </w:rPr>
+            </w:pPr>
+            <w:r>
+              <w:rPr>
+                <w:rFonts w:ascii="Tahoma" w:hAnsi="Tahoma" w:cs="Tahoma"/>
+                <w:bCs/>
+                <w:sz w:val="20"/>
+                <w:szCs w:val="20"/>
+              </w:rPr>
+              <w:t xml:space="preserve">1.1.2: </w:t>
+            </w:r>
+            <w:r>
+              <w:rPr>
+                <w:rFonts w:ascii="Tahoma" w:hAnsi="Tahoma" w:cs="Tahoma"/>
+                <w:bCs/>
+                <w:sz w:val="20"/>
+                <w:szCs w:val="20"/>
+              </w:rPr>
+              <w:t>Plan de Dirección del Proyecto</w:t>
+            </w:r>
+          </w:p>
+        </w:tc>
+        <w:tc>
+          <w:tcPr>
+            <w:tcW w:w="5228" w:type="dxa"/>
+          </w:tcPr>
+          <w:p>
+            <w:pPr>
+              <w:spacing w:after="0" w:afterAutospacing="0"/>
+              <w:jc w:val="both"/>
+              <w:rPr>
+                <w:rFonts w:ascii="Tahoma" w:hAnsi="Tahoma" w:cs="Tahoma"/>
+                <w:bCs/>
+                <w:sz w:val="20"/>
+                <w:szCs w:val="20"/>
+              </w:rPr>
+            </w:pPr>
+            <w:r>
+              <w:rPr>
+                <w:rFonts w:ascii="Tahoma" w:hAnsi="Tahoma" w:cs="Tahoma"/>
+                <w:bCs/>
+                <w:sz w:val="20"/>
+                <w:szCs w:val="20"/>
+              </w:rPr>
+              <w:t>90€</w:t>
+            </w:r>
+          </w:p>
+        </w:tc>
+      </w:tr>
+      <w:tr>
+        <w:tc>
+          <w:tcPr>
+            <w:tcW w:w="5228" w:type="dxa"/>
+          </w:tcPr>
+          <w:p>
+            <w:pPr>
+              <w:spacing w:after="0" w:afterAutospacing="0"/>
+              <w:jc w:val="both"/>
+              <w:rPr>
+                <w:rFonts w:ascii="Tahoma" w:hAnsi="Tahoma" w:cs="Tahoma"/>
+                <w:bCs/>
+                <w:sz w:val="20"/>
+                <w:szCs w:val="20"/>
+              </w:rPr>
+            </w:pPr>
+            <w:r>
+              <w:rPr>
+                <w:rFonts w:ascii="Tahoma" w:hAnsi="Tahoma" w:cs="Tahoma"/>
+                <w:bCs/>
+                <w:sz w:val="20"/>
+                <w:szCs w:val="20"/>
+              </w:rPr>
+              <w:t>1.1.3</w:t>
+            </w:r>
+            <w:r>
+              <w:rPr>
+                <w:rFonts w:ascii="Tahoma" w:hAnsi="Tahoma" w:cs="Tahoma"/>
+                <w:bCs/>
+                <w:sz w:val="20"/>
+                <w:szCs w:val="20"/>
+              </w:rPr>
+              <w:t>: Requisitos</w:t>
+            </w:r>
+          </w:p>
+        </w:tc>
+        <w:tc>
+          <w:tcPr>
+            <w:tcW w:w="5228" w:type="dxa"/>
+          </w:tcPr>
+          <w:p>
+            <w:pPr>
+              <w:spacing w:after="0" w:afterAutospacing="0"/>
+              <w:jc w:val="both"/>
+              <w:rPr>
+                <w:rFonts w:ascii="Tahoma" w:hAnsi="Tahoma" w:cs="Tahoma"/>
+                <w:bCs/>
+                <w:sz w:val="20"/>
+                <w:szCs w:val="20"/>
+              </w:rPr>
+            </w:pPr>
+            <w:r>
+              <w:rPr>
+                <w:rFonts w:ascii="Tahoma" w:hAnsi="Tahoma" w:cs="Tahoma"/>
+                <w:bCs/>
+                <w:sz w:val="20"/>
+                <w:szCs w:val="20"/>
+              </w:rPr>
+              <w:t>420€</w:t>
+            </w:r>
+          </w:p>
+        </w:tc>
+      </w:tr>
+      <w:tr>
+        <w:tc>
+          <w:tcPr>
+            <w:tcW w:w="5228" w:type="dxa"/>
+          </w:tcPr>
+          <w:p>
+            <w:pPr>
+              <w:spacing w:after="0" w:afterAutospacing="0"/>
+              <w:jc w:val="both"/>
+              <w:rPr>
+                <w:rFonts w:ascii="Tahoma" w:hAnsi="Tahoma" w:cs="Tahoma"/>
+                <w:bCs/>
+                <w:sz w:val="20"/>
+                <w:szCs w:val="20"/>
+              </w:rPr>
+            </w:pPr>
+            <w:r>
+              <w:rPr>
+                <w:rFonts w:ascii="Tahoma" w:hAnsi="Tahoma" w:cs="Tahoma"/>
+                <w:bCs/>
+                <w:sz w:val="20"/>
+                <w:szCs w:val="20"/>
+              </w:rPr>
+              <w:t>1.1.4</w:t>
+            </w:r>
+            <w:r>
+              <w:rPr>
+                <w:rFonts w:ascii="Tahoma" w:hAnsi="Tahoma" w:cs="Tahoma"/>
+                <w:bCs/>
+                <w:sz w:val="20"/>
+                <w:szCs w:val="20"/>
+              </w:rPr>
+              <w:t xml:space="preserve">: </w:t>
+            </w:r>
+            <w:r>
+              <w:rPr>
+                <w:rFonts w:ascii="Tahoma" w:hAnsi="Tahoma" w:cs="Tahoma"/>
+                <w:bCs/>
+                <w:sz w:val="20"/>
+                <w:szCs w:val="20"/>
+              </w:rPr>
+              <w:t>Alcance</w:t>
+            </w:r>
+          </w:p>
+        </w:tc>
+        <w:tc>
+          <w:tcPr>
+            <w:tcW w:w="5228" w:type="dxa"/>
+          </w:tcPr>
+          <w:p>
+            <w:pPr>
+              <w:spacing w:after="0" w:afterAutospacing="0"/>
+              <w:jc w:val="both"/>
+              <w:rPr>
+                <w:rFonts w:ascii="Tahoma" w:hAnsi="Tahoma" w:cs="Tahoma"/>
+                <w:bCs/>
+                <w:sz w:val="20"/>
+                <w:szCs w:val="20"/>
+              </w:rPr>
+            </w:pPr>
+            <w:r>
+              <w:rPr>
+                <w:rFonts w:ascii="Tahoma" w:hAnsi="Tahoma" w:cs="Tahoma"/>
+                <w:bCs/>
+                <w:sz w:val="20"/>
+                <w:szCs w:val="20"/>
+              </w:rPr>
+              <w:t>180€</w:t>
+            </w:r>
+          </w:p>
+        </w:tc>
+      </w:tr>
+      <w:tr>
+        <w:tc>
+          <w:tcPr>
+            <w:tcW w:w="5228" w:type="dxa"/>
+          </w:tcPr>
+          <w:p>
+            <w:pPr>
+              <w:spacing w:after="0" w:afterAutospacing="0"/>
+              <w:jc w:val="both"/>
+              <w:rPr>
+                <w:rFonts w:ascii="Tahoma" w:hAnsi="Tahoma" w:cs="Tahoma"/>
+                <w:bCs/>
+                <w:sz w:val="20"/>
+                <w:szCs w:val="20"/>
+              </w:rPr>
+            </w:pPr>
+            <w:r>
+              <w:rPr>
+                <w:rFonts w:ascii="Tahoma" w:hAnsi="Tahoma" w:cs="Tahoma"/>
+                <w:bCs/>
+                <w:sz w:val="20"/>
+                <w:szCs w:val="20"/>
+              </w:rPr>
+              <w:t>1.1.5</w:t>
+            </w:r>
+            <w:r>
+              <w:rPr>
+                <w:rFonts w:ascii="Tahoma" w:hAnsi="Tahoma" w:cs="Tahoma"/>
+                <w:bCs/>
+                <w:sz w:val="20"/>
+                <w:szCs w:val="20"/>
+              </w:rPr>
+              <w:t xml:space="preserve">: </w:t>
+            </w:r>
+            <w:r>
+              <w:rPr>
+                <w:rFonts w:ascii="Tahoma" w:hAnsi="Tahoma" w:cs="Tahoma"/>
+                <w:bCs/>
+                <w:sz w:val="20"/>
+                <w:szCs w:val="20"/>
+              </w:rPr>
+              <w:t>Costes</w:t>
+            </w:r>
+          </w:p>
+        </w:tc>
+        <w:tc>
+          <w:tcPr>
+            <w:tcW w:w="5228" w:type="dxa"/>
+          </w:tcPr>
+          <w:p>
+            <w:pPr>
+              <w:spacing w:after="0" w:afterAutospacing="0"/>
+              <w:jc w:val="both"/>
+              <w:rPr>
+                <w:rFonts w:ascii="Tahoma" w:hAnsi="Tahoma" w:cs="Tahoma"/>
+                <w:bCs/>
+                <w:sz w:val="20"/>
+                <w:szCs w:val="20"/>
+              </w:rPr>
+            </w:pPr>
+            <w:r>
+              <w:rPr>
+                <w:rFonts w:ascii="Tahoma" w:hAnsi="Tahoma" w:cs="Tahoma"/>
+                <w:bCs/>
+                <w:sz w:val="20"/>
+                <w:szCs w:val="20"/>
+              </w:rPr>
+              <w:t>90€</w:t>
+            </w:r>
+          </w:p>
+        </w:tc>
+      </w:tr>
+      <w:tr>
+        <w:tc>
+          <w:tcPr>
+            <w:tcW w:w="5228" w:type="dxa"/>
+          </w:tcPr>
+          <w:p>
+            <w:pPr>
+              <w:spacing w:after="0" w:afterAutospacing="0"/>
+              <w:jc w:val="both"/>
+              <w:rPr>
+                <w:rFonts w:ascii="Tahoma" w:hAnsi="Tahoma" w:cs="Tahoma"/>
+                <w:bCs/>
+                <w:sz w:val="20"/>
+                <w:szCs w:val="20"/>
+              </w:rPr>
+            </w:pPr>
+            <w:r>
+              <w:rPr>
+                <w:rFonts w:ascii="Tahoma" w:hAnsi="Tahoma" w:cs="Tahoma"/>
+                <w:bCs/>
+                <w:sz w:val="20"/>
+                <w:szCs w:val="20"/>
+              </w:rPr>
+              <w:t>1.1.6</w:t>
+            </w:r>
+            <w:r>
+              <w:rPr>
+                <w:rFonts w:ascii="Tahoma" w:hAnsi="Tahoma" w:cs="Tahoma"/>
+                <w:bCs/>
+                <w:sz w:val="20"/>
+                <w:szCs w:val="20"/>
+              </w:rPr>
+              <w:t>: Cronograma</w:t>
+            </w:r>
+          </w:p>
+        </w:tc>
+        <w:tc>
+          <w:tcPr>
+            <w:tcW w:w="5228" w:type="dxa"/>
+          </w:tcPr>
+          <w:p>
+            <w:pPr>
+              <w:spacing w:after="0" w:afterAutospacing="0"/>
+              <w:jc w:val="both"/>
+              <w:rPr>
+                <w:rFonts w:ascii="Tahoma" w:hAnsi="Tahoma" w:cs="Tahoma"/>
+                <w:bCs/>
+                <w:sz w:val="20"/>
+                <w:szCs w:val="20"/>
+              </w:rPr>
+            </w:pPr>
+            <w:r>
+              <w:rPr>
+                <w:rFonts w:ascii="Tahoma" w:hAnsi="Tahoma" w:cs="Tahoma"/>
+                <w:bCs/>
+                <w:sz w:val="20"/>
+                <w:szCs w:val="20"/>
+              </w:rPr>
+              <w:t>60€</w:t>
+            </w:r>
+          </w:p>
+        </w:tc>
+      </w:tr>
+      <w:tr>
+        <w:tc>
+          <w:tcPr>
+            <w:tcW w:w="5228" w:type="dxa"/>
+          </w:tcPr>
+          <w:p>
+            <w:pPr>
+              <w:spacing w:after="0" w:afterAutospacing="0"/>
+              <w:jc w:val="both"/>
+              <w:rPr>
+                <w:rFonts w:ascii="Tahoma" w:hAnsi="Tahoma" w:cs="Tahoma"/>
+                <w:bCs/>
+                <w:sz w:val="20"/>
+                <w:szCs w:val="20"/>
+              </w:rPr>
+            </w:pPr>
+            <w:r>
+              <w:rPr>
+                <w:rFonts w:ascii="Tahoma" w:hAnsi="Tahoma" w:cs="Tahoma"/>
+                <w:bCs/>
+                <w:sz w:val="20"/>
+                <w:szCs w:val="20"/>
+              </w:rPr>
+              <w:t>1.1.7</w:t>
+            </w:r>
+            <w:r>
+              <w:rPr>
+                <w:rFonts w:ascii="Tahoma" w:hAnsi="Tahoma" w:cs="Tahoma"/>
+                <w:bCs/>
+                <w:sz w:val="20"/>
+                <w:szCs w:val="20"/>
+              </w:rPr>
+              <w:t>: Riesgos</w:t>
+            </w:r>
+          </w:p>
+        </w:tc>
+        <w:tc>
+          <w:tcPr>
+            <w:tcW w:w="5228" w:type="dxa"/>
+          </w:tcPr>
+          <w:p>
+            <w:pPr>
+              <w:spacing w:after="0" w:afterAutospacing="0"/>
+              <w:jc w:val="both"/>
+              <w:rPr>
+                <w:rFonts w:ascii="Tahoma" w:hAnsi="Tahoma" w:cs="Tahoma"/>
+                <w:bCs/>
+                <w:sz w:val="20"/>
+                <w:szCs w:val="20"/>
+              </w:rPr>
+            </w:pPr>
+            <w:r>
+              <w:rPr>
+                <w:rFonts w:ascii="Tahoma" w:hAnsi="Tahoma" w:cs="Tahoma"/>
+                <w:bCs/>
+                <w:sz w:val="20"/>
+                <w:szCs w:val="20"/>
+              </w:rPr>
+              <w:t>240€</w:t>
+            </w:r>
+          </w:p>
+        </w:tc>
+      </w:tr>
+      <w:tr>
+        <w:tc>
+          <w:tcPr>
+            <w:tcW w:w="5228" w:type="dxa"/>
+          </w:tcPr>
+          <w:p>
+            <w:pPr>
+              <w:spacing w:after="0" w:afterAutospacing="0"/>
+              <w:jc w:val="both"/>
+              <w:rPr>
+                <w:rFonts w:ascii="Tahoma" w:hAnsi="Tahoma" w:cs="Tahoma"/>
+                <w:bCs/>
+                <w:sz w:val="20"/>
+                <w:szCs w:val="20"/>
+              </w:rPr>
+            </w:pPr>
+            <w:r>
+              <w:rPr>
+                <w:rFonts w:ascii="Tahoma" w:hAnsi="Tahoma" w:cs="Tahoma"/>
+                <w:bCs/>
+                <w:sz w:val="20"/>
+                <w:szCs w:val="20"/>
+              </w:rPr>
+              <w:t>1.1.8: Calidad</w:t>
+            </w:r>
+          </w:p>
+        </w:tc>
+        <w:tc>
+          <w:tcPr>
+            <w:tcW w:w="5228" w:type="dxa"/>
+          </w:tcPr>
+          <w:p>
+            <w:pPr>
+              <w:spacing w:after="0" w:afterAutospacing="0"/>
+              <w:jc w:val="both"/>
+              <w:rPr>
+                <w:rFonts w:ascii="Tahoma" w:hAnsi="Tahoma" w:cs="Tahoma"/>
+                <w:bCs/>
+                <w:sz w:val="20"/>
+                <w:szCs w:val="20"/>
+              </w:rPr>
+            </w:pPr>
+            <w:r>
+              <w:rPr>
+                <w:rFonts w:ascii="Tahoma" w:hAnsi="Tahoma" w:cs="Tahoma"/>
+                <w:bCs/>
+                <w:sz w:val="20"/>
+                <w:szCs w:val="20"/>
+              </w:rPr>
+              <w:t>90€</w:t>
+            </w:r>
+          </w:p>
+        </w:tc>
+      </w:tr>
+      <w:tr>
+        <w:tc>
+          <w:tcPr>
+            <w:tcW w:w="5228" w:type="dxa"/>
+          </w:tcPr>
+          <w:p>
+            <w:pPr>
+              <w:spacing w:after="0"/>
+              <w:jc w:val="both"/>
+              <w:rPr>
+                <w:rFonts w:ascii="Tahoma" w:hAnsi="Tahoma" w:cs="Tahoma"/>
+                <w:bCs/>
+                <w:sz w:val="20"/>
+                <w:szCs w:val="20"/>
+              </w:rPr>
+            </w:pPr>
+            <w:r>
+              <w:rPr>
+                <w:rFonts w:ascii="Tahoma" w:hAnsi="Tahoma" w:cs="Tahoma"/>
+                <w:bCs/>
+                <w:sz w:val="20"/>
+                <w:szCs w:val="20"/>
+              </w:rPr>
+              <w:t xml:space="preserve">1.1.9: </w:t>
+            </w:r>
+            <w:r>
+              <w:rPr>
+                <w:rFonts w:ascii="Tahoma" w:hAnsi="Tahoma" w:cs="Tahoma"/>
+                <w:bCs/>
+                <w:sz w:val="20"/>
+                <w:szCs w:val="20"/>
+              </w:rPr>
+              <w:t>Seguimiento</w:t>
+            </w:r>
+          </w:p>
+        </w:tc>
+        <w:tc>
+          <w:tcPr>
+            <w:tcW w:w="5228" w:type="dxa"/>
+          </w:tcPr>
+          <w:p>
+            <w:pPr>
+              <w:spacing w:after="0" w:afterAutospacing="0"/>
+              <w:jc w:val="both"/>
+              <w:rPr>
+                <w:rFonts w:ascii="Tahoma" w:hAnsi="Tahoma" w:cs="Tahoma"/>
+                <w:bCs/>
+                <w:sz w:val="20"/>
+                <w:szCs w:val="20"/>
+              </w:rPr>
+            </w:pPr>
+            <w:r>
+              <w:rPr>
+                <w:rFonts w:ascii="Tahoma" w:hAnsi="Tahoma" w:cs="Tahoma"/>
+                <w:bCs/>
+                <w:sz w:val="20"/>
+                <w:szCs w:val="20"/>
+              </w:rPr>
+              <w:t>270€</w:t>
+            </w:r>
+          </w:p>
+        </w:tc>
+      </w:tr>
+      <w:tr>
+        <w:tc>
+          <w:tcPr>
+            <w:tcW w:w="5228" w:type="dxa"/>
+          </w:tcPr>
+          <w:p>
+            <w:pPr>
+              <w:spacing w:after="0" w:afterAutospacing="0"/>
+              <w:jc w:val="both"/>
+              <w:rPr>
+                <w:rFonts w:ascii="Tahoma" w:hAnsi="Tahoma" w:cs="Tahoma"/>
+                <w:bCs/>
+                <w:sz w:val="20"/>
+                <w:szCs w:val="20"/>
+              </w:rPr>
+            </w:pPr>
+            <w:r>
+              <w:rPr>
+                <w:rFonts w:ascii="Tahoma" w:hAnsi="Tahoma" w:cs="Tahoma"/>
+                <w:bCs/>
+                <w:sz w:val="20"/>
+                <w:szCs w:val="20"/>
+              </w:rPr>
+              <w:t>2.1.1: Diseño funcional</w:t>
+            </w:r>
+          </w:p>
+        </w:tc>
+        <w:tc>
+          <w:tcPr>
+            <w:tcW w:w="5228" w:type="dxa"/>
+          </w:tcPr>
+          <w:p>
+            <w:pPr>
+              <w:spacing w:after="0" w:afterAutospacing="0"/>
+              <w:jc w:val="both"/>
+              <w:rPr>
+                <w:rFonts w:ascii="Tahoma" w:hAnsi="Tahoma" w:cs="Tahoma"/>
+                <w:bCs/>
+                <w:sz w:val="20"/>
+                <w:szCs w:val="20"/>
+              </w:rPr>
+            </w:pPr>
+            <w:r>
+              <w:rPr>
+                <w:rFonts w:ascii="Tahoma" w:hAnsi="Tahoma" w:cs="Tahoma"/>
+                <w:bCs/>
+                <w:sz w:val="20"/>
+                <w:szCs w:val="20"/>
+              </w:rPr>
+              <w:t>250€</w:t>
+            </w:r>
+          </w:p>
+        </w:tc>
+      </w:tr>
+      <w:tr>
+        <w:tc>
+          <w:tcPr>
+            <w:tcW w:w="5228" w:type="dxa"/>
+          </w:tcPr>
+          <w:p>
+            <w:pPr>
+              <w:spacing w:after="0" w:afterAutospacing="0"/>
+              <w:jc w:val="both"/>
+              <w:rPr>
+                <w:rFonts w:ascii="Tahoma" w:hAnsi="Tahoma" w:cs="Tahoma"/>
+                <w:bCs/>
+                <w:sz w:val="20"/>
+                <w:szCs w:val="20"/>
+              </w:rPr>
+            </w:pPr>
+            <w:r>
+              <w:rPr>
+                <w:rFonts w:ascii="Tahoma" w:hAnsi="Tahoma" w:cs="Tahoma"/>
+                <w:bCs/>
+                <w:sz w:val="20"/>
+                <w:szCs w:val="20"/>
+              </w:rPr>
+              <w:t>2.1.2: Movimiento base</w:t>
+            </w:r>
+          </w:p>
+        </w:tc>
+        <w:tc>
+          <w:tcPr>
+            <w:tcW w:w="5228" w:type="dxa"/>
+          </w:tcPr>
+          <w:p>
+            <w:pPr>
+              <w:spacing w:after="0" w:afterAutospacing="0"/>
+              <w:jc w:val="both"/>
+              <w:rPr>
+                <w:rFonts w:ascii="Tahoma" w:hAnsi="Tahoma" w:cs="Tahoma"/>
+                <w:bCs/>
+                <w:sz w:val="20"/>
+                <w:szCs w:val="20"/>
+              </w:rPr>
+            </w:pPr>
+            <w:r>
+              <w:rPr>
+                <w:rFonts w:ascii="Tahoma" w:hAnsi="Tahoma" w:cs="Tahoma"/>
+                <w:bCs/>
+                <w:sz w:val="20"/>
+                <w:szCs w:val="20"/>
+              </w:rPr>
+              <w:t>336€</w:t>
+            </w:r>
+          </w:p>
+        </w:tc>
+      </w:tr>
+      <w:tr>
+        <w:tc>
+          <w:tcPr>
+            <w:tcW w:w="5228" w:type="dxa"/>
+          </w:tcPr>
+          <w:p>
+            <w:pPr>
+              <w:spacing w:after="0" w:afterAutospacing="0"/>
+              <w:jc w:val="both"/>
+              <w:rPr>
+                <w:rFonts w:ascii="Tahoma" w:hAnsi="Tahoma" w:cs="Tahoma"/>
+                <w:bCs/>
+                <w:sz w:val="20"/>
+                <w:szCs w:val="20"/>
+              </w:rPr>
+            </w:pPr>
+            <w:r>
+              <w:rPr>
+                <w:rFonts w:ascii="Tahoma" w:hAnsi="Tahoma" w:cs="Tahoma"/>
+                <w:bCs/>
+                <w:sz w:val="20"/>
+                <w:szCs w:val="20"/>
+              </w:rPr>
+              <w:t>2.1.3: Sistema de combate básico</w:t>
+            </w:r>
+          </w:p>
+        </w:tc>
+        <w:tc>
+          <w:tcPr>
+            <w:tcW w:w="5228" w:type="dxa"/>
+          </w:tcPr>
+          <w:p>
+            <w:pPr>
+              <w:spacing w:after="0" w:afterAutospacing="0"/>
+              <w:jc w:val="both"/>
+              <w:rPr>
+                <w:rFonts w:ascii="Tahoma" w:hAnsi="Tahoma" w:cs="Tahoma"/>
+                <w:bCs/>
+                <w:sz w:val="20"/>
+                <w:szCs w:val="20"/>
+              </w:rPr>
+            </w:pPr>
+            <w:r>
+              <w:rPr>
+                <w:rFonts w:ascii="Tahoma" w:hAnsi="Tahoma" w:cs="Tahoma"/>
+                <w:bCs/>
+                <w:sz w:val="20"/>
+                <w:szCs w:val="20"/>
+              </w:rPr>
+              <w:t>315€</w:t>
+            </w:r>
+          </w:p>
+        </w:tc>
+      </w:tr>
+      <w:tr>
+        <w:tc>
+          <w:tcPr>
+            <w:tcW w:w="5228" w:type="dxa"/>
+          </w:tcPr>
+          <w:p>
+            <w:pPr>
+              <w:spacing w:after="0" w:afterAutospacing="0"/>
+              <w:jc w:val="both"/>
+              <w:rPr>
+                <w:rFonts w:ascii="Tahoma" w:hAnsi="Tahoma" w:cs="Tahoma"/>
+                <w:bCs/>
+                <w:sz w:val="20"/>
+                <w:szCs w:val="20"/>
+              </w:rPr>
+            </w:pPr>
+            <w:r>
+              <w:rPr>
+                <w:rFonts w:ascii="Tahoma" w:hAnsi="Tahoma" w:cs="Tahoma"/>
+                <w:bCs/>
+                <w:sz w:val="20"/>
+                <w:szCs w:val="20"/>
+              </w:rPr>
+              <w:t>2.1.4: Sistema de poderes</w:t>
+            </w:r>
+          </w:p>
+        </w:tc>
+        <w:tc>
+          <w:tcPr>
+            <w:tcW w:w="5228" w:type="dxa"/>
+          </w:tcPr>
+          <w:p>
+            <w:pPr>
+              <w:spacing w:after="0" w:afterAutospacing="0"/>
+              <w:jc w:val="both"/>
+              <w:rPr>
+                <w:rFonts w:ascii="Tahoma" w:hAnsi="Tahoma" w:cs="Tahoma"/>
+                <w:bCs/>
+                <w:sz w:val="20"/>
+                <w:szCs w:val="20"/>
+              </w:rPr>
+            </w:pPr>
+            <w:r>
+              <w:rPr>
+                <w:rFonts w:ascii="Tahoma" w:hAnsi="Tahoma" w:cs="Tahoma"/>
+                <w:bCs/>
+                <w:sz w:val="20"/>
+                <w:szCs w:val="20"/>
+              </w:rPr>
+              <w:t>483€</w:t>
+            </w:r>
+          </w:p>
+        </w:tc>
+      </w:tr>
+      <w:tr>
+        <w:tc>
+          <w:tcPr>
+            <w:tcW w:w="5228" w:type="dxa"/>
+          </w:tcPr>
+          <w:p>
+            <w:pPr>
+              <w:spacing w:after="0" w:afterAutospacing="0"/>
+              <w:jc w:val="both"/>
+              <w:rPr>
+                <w:rFonts w:ascii="Tahoma" w:hAnsi="Tahoma" w:cs="Tahoma"/>
+                <w:bCs/>
+                <w:sz w:val="20"/>
+                <w:szCs w:val="20"/>
+              </w:rPr>
+            </w:pPr>
+            <w:r>
+              <w:rPr>
+                <w:rFonts w:ascii="Tahoma" w:hAnsi="Tahoma" w:cs="Tahoma"/>
+                <w:bCs/>
+                <w:sz w:val="20"/>
+                <w:szCs w:val="20"/>
+              </w:rPr>
+              <w:t>2.1.5: Sistema de vida y daño del jugador</w:t>
+            </w:r>
+          </w:p>
+        </w:tc>
+        <w:tc>
+          <w:tcPr>
+            <w:tcW w:w="5228" w:type="dxa"/>
+          </w:tcPr>
+          <w:p>
+            <w:pPr>
+              <w:spacing w:after="0" w:afterAutospacing="0"/>
+              <w:jc w:val="both"/>
+              <w:rPr>
+                <w:rFonts w:ascii="Tahoma" w:hAnsi="Tahoma" w:cs="Tahoma"/>
+                <w:bCs/>
+                <w:sz w:val="20"/>
+                <w:szCs w:val="20"/>
+              </w:rPr>
+            </w:pPr>
+            <w:r>
+              <w:rPr>
+                <w:rFonts w:ascii="Tahoma" w:hAnsi="Tahoma" w:cs="Tahoma"/>
+                <w:bCs/>
+                <w:sz w:val="20"/>
+                <w:szCs w:val="20"/>
+              </w:rPr>
+              <w:t>399€</w:t>
+            </w:r>
+          </w:p>
+        </w:tc>
+      </w:tr>
+      <w:tr>
+        <w:tc>
+          <w:tcPr>
+            <w:tcW w:w="5228" w:type="dxa"/>
+          </w:tcPr>
+          <w:p>
+            <w:pPr>
+              <w:spacing w:after="0" w:afterAutospacing="0"/>
+              <w:jc w:val="both"/>
+              <w:rPr>
+                <w:rFonts w:ascii="Tahoma" w:hAnsi="Tahoma" w:cs="Tahoma"/>
+                <w:bCs/>
+                <w:sz w:val="20"/>
+                <w:szCs w:val="20"/>
+              </w:rPr>
+            </w:pPr>
+            <w:r>
+              <w:rPr>
+                <w:rFonts w:ascii="Tahoma" w:hAnsi="Tahoma" w:cs="Tahoma"/>
+                <w:bCs/>
+                <w:sz w:val="20"/>
+                <w:szCs w:val="20"/>
+              </w:rPr>
+              <w:t>2.1.6: Arte y animaciones del jugador</w:t>
+            </w:r>
+          </w:p>
+        </w:tc>
+        <w:tc>
+          <w:tcPr>
+            <w:tcW w:w="5228" w:type="dxa"/>
+          </w:tcPr>
+          <w:p>
+            <w:pPr>
+              <w:spacing w:after="0" w:afterAutospacing="0"/>
+              <w:jc w:val="both"/>
+              <w:rPr>
+                <w:rFonts w:ascii="Tahoma" w:hAnsi="Tahoma" w:cs="Tahoma"/>
+                <w:bCs/>
+                <w:sz w:val="20"/>
+                <w:szCs w:val="20"/>
+              </w:rPr>
+            </w:pPr>
+            <w:r>
+              <w:rPr>
+                <w:rFonts w:ascii="Tahoma" w:hAnsi="Tahoma" w:cs="Tahoma"/>
+                <w:bCs/>
+                <w:sz w:val="20"/>
+                <w:szCs w:val="20"/>
+              </w:rPr>
+              <w:t>750€</w:t>
+            </w:r>
+          </w:p>
+        </w:tc>
+      </w:tr>
+      <w:tr>
+        <w:tc>
+          <w:tcPr>
+            <w:tcW w:w="5228" w:type="dxa"/>
+          </w:tcPr>
+          <w:p>
+            <w:pPr>
+              <w:spacing w:after="0" w:afterAutospacing="0"/>
+              <w:jc w:val="both"/>
+              <w:rPr>
+                <w:rFonts w:ascii="Tahoma" w:hAnsi="Tahoma" w:cs="Tahoma"/>
+                <w:bCs/>
+                <w:sz w:val="20"/>
+                <w:szCs w:val="20"/>
+              </w:rPr>
+            </w:pPr>
+            <w:r>
+              <w:rPr>
+                <w:rFonts w:ascii="Tahoma" w:hAnsi="Tahoma" w:cs="Tahoma"/>
+                <w:bCs/>
+                <w:sz w:val="20"/>
+                <w:szCs w:val="20"/>
+              </w:rPr>
+              <w:t>2.2.1: Diseño de arquetipos</w:t>
+            </w:r>
+          </w:p>
+        </w:tc>
+        <w:tc>
+          <w:tcPr>
+            <w:tcW w:w="5228" w:type="dxa"/>
+          </w:tcPr>
+          <w:p>
+            <w:pPr>
+              <w:spacing w:after="0" w:afterAutospacing="0"/>
+              <w:jc w:val="both"/>
+              <w:rPr>
+                <w:rFonts w:ascii="Tahoma" w:hAnsi="Tahoma" w:cs="Tahoma"/>
+                <w:bCs/>
+                <w:sz w:val="20"/>
+                <w:szCs w:val="20"/>
+              </w:rPr>
+            </w:pPr>
+            <w:r>
+              <w:rPr>
+                <w:rFonts w:ascii="Tahoma" w:hAnsi="Tahoma" w:cs="Tahoma"/>
+                <w:bCs/>
+                <w:sz w:val="20"/>
+                <w:szCs w:val="20"/>
+              </w:rPr>
+              <w:t>275€</w:t>
+            </w:r>
+          </w:p>
+        </w:tc>
+      </w:tr>
+      <w:tr>
+        <w:tc>
+          <w:tcPr>
+            <w:tcW w:w="5228" w:type="dxa"/>
+          </w:tcPr>
+          <w:p>
+            <w:pPr>
+              <w:spacing w:after="0" w:afterAutospacing="0"/>
+              <w:jc w:val="both"/>
+              <w:rPr>
+                <w:rFonts w:ascii="Tahoma" w:hAnsi="Tahoma" w:cs="Tahoma"/>
+                <w:bCs/>
+                <w:sz w:val="20"/>
+                <w:szCs w:val="20"/>
+              </w:rPr>
+            </w:pPr>
+            <w:r>
+              <w:rPr>
+                <w:rFonts w:ascii="Tahoma" w:hAnsi="Tahoma" w:cs="Tahoma"/>
+                <w:bCs/>
+                <w:sz w:val="20"/>
+                <w:szCs w:val="20"/>
+              </w:rPr>
+              <w:t>2.2.2: Programación de IA Básica</w:t>
+            </w:r>
+          </w:p>
+        </w:tc>
+        <w:tc>
+          <w:tcPr>
+            <w:tcW w:w="5228" w:type="dxa"/>
+          </w:tcPr>
+          <w:p>
+            <w:pPr>
+              <w:spacing w:after="0" w:afterAutospacing="0"/>
+              <w:jc w:val="both"/>
+              <w:rPr>
+                <w:rFonts w:ascii="Tahoma" w:hAnsi="Tahoma" w:cs="Tahoma"/>
+                <w:bCs/>
+                <w:sz w:val="20"/>
+                <w:szCs w:val="20"/>
+              </w:rPr>
+            </w:pPr>
+            <w:r>
+              <w:rPr>
+                <w:rFonts w:ascii="Tahoma" w:hAnsi="Tahoma" w:cs="Tahoma"/>
+                <w:bCs/>
+                <w:sz w:val="20"/>
+                <w:szCs w:val="20"/>
+              </w:rPr>
+              <w:t>882€</w:t>
+            </w:r>
+          </w:p>
+        </w:tc>
+      </w:tr>
+      <w:tr>
+        <w:tc>
+          <w:tcPr>
+            <w:tcW w:w="5228" w:type="dxa"/>
+          </w:tcPr>
+          <w:p>
+            <w:pPr>
+              <w:spacing w:after="0" w:afterAutospacing="0"/>
+              <w:jc w:val="both"/>
+              <w:rPr>
+                <w:rFonts w:ascii="Tahoma" w:hAnsi="Tahoma" w:cs="Tahoma"/>
+                <w:bCs/>
+                <w:sz w:val="20"/>
+                <w:szCs w:val="20"/>
+              </w:rPr>
+            </w:pPr>
+            <w:r>
+              <w:rPr>
+                <w:rFonts w:ascii="Tahoma" w:hAnsi="Tahoma" w:cs="Tahoma"/>
+                <w:bCs/>
+                <w:sz w:val="20"/>
+                <w:szCs w:val="20"/>
+              </w:rPr>
+              <w:t>2.2.3: Sistema de spawn y despawn</w:t>
+            </w:r>
+          </w:p>
+        </w:tc>
+        <w:tc>
+          <w:tcPr>
+            <w:tcW w:w="5228" w:type="dxa"/>
+          </w:tcPr>
+          <w:p>
+            <w:pPr>
+              <w:spacing w:after="0" w:afterAutospacing="0"/>
+              <w:jc w:val="both"/>
+              <w:rPr>
+                <w:rFonts w:ascii="Tahoma" w:hAnsi="Tahoma" w:cs="Tahoma"/>
+                <w:bCs/>
+                <w:sz w:val="20"/>
+                <w:szCs w:val="20"/>
+              </w:rPr>
+            </w:pPr>
+            <w:r>
+              <w:rPr>
+                <w:rFonts w:ascii="Tahoma" w:hAnsi="Tahoma" w:cs="Tahoma"/>
+                <w:bCs/>
+                <w:sz w:val="20"/>
+                <w:szCs w:val="20"/>
+              </w:rPr>
+              <w:t>168€</w:t>
+            </w:r>
+          </w:p>
+        </w:tc>
+      </w:tr>
+      <w:tr>
+        <w:tc>
+          <w:tcPr>
+            <w:tcW w:w="5228" w:type="dxa"/>
+          </w:tcPr>
+          <w:p>
+            <w:pPr>
+              <w:spacing w:after="0" w:afterAutospacing="0"/>
+              <w:jc w:val="both"/>
+              <w:rPr>
+                <w:rFonts w:ascii="Tahoma" w:hAnsi="Tahoma" w:cs="Tahoma"/>
+                <w:bCs/>
+                <w:sz w:val="20"/>
+                <w:szCs w:val="20"/>
+              </w:rPr>
+            </w:pPr>
+            <w:r>
+              <w:rPr>
+                <w:rFonts w:ascii="Tahoma" w:hAnsi="Tahoma" w:cs="Tahoma"/>
+                <w:bCs/>
+                <w:sz w:val="20"/>
+                <w:szCs w:val="20"/>
+              </w:rPr>
+              <w:t xml:space="preserve">2.2.4: </w:t>
+            </w:r>
+            <w:r>
+              <w:rPr>
+                <w:rFonts w:ascii="Tahoma" w:hAnsi="Tahoma" w:cs="Tahoma"/>
+                <w:bCs/>
+                <w:sz w:val="20"/>
+                <w:szCs w:val="20"/>
+              </w:rPr>
+              <w:t>Sistema de vida y daño de los enemigos</w:t>
+            </w:r>
+          </w:p>
+        </w:tc>
+        <w:tc>
+          <w:tcPr>
+            <w:tcW w:w="5228" w:type="dxa"/>
+          </w:tcPr>
+          <w:p>
+            <w:pPr>
+              <w:spacing w:after="0" w:afterAutospacing="0"/>
+              <w:jc w:val="both"/>
+              <w:rPr>
+                <w:rFonts w:ascii="Tahoma" w:hAnsi="Tahoma" w:cs="Tahoma"/>
+                <w:bCs/>
+                <w:sz w:val="20"/>
+                <w:szCs w:val="20"/>
+              </w:rPr>
+            </w:pPr>
+            <w:r>
+              <w:rPr>
+                <w:rFonts w:ascii="Tahoma" w:hAnsi="Tahoma" w:cs="Tahoma"/>
+                <w:bCs/>
+                <w:sz w:val="20"/>
+                <w:szCs w:val="20"/>
+              </w:rPr>
+              <w:t>231€</w:t>
+            </w:r>
+          </w:p>
+        </w:tc>
+      </w:tr>
+      <w:tr>
+        <w:tc>
+          <w:tcPr>
+            <w:tcW w:w="5228" w:type="dxa"/>
+          </w:tcPr>
+          <w:p>
+            <w:pPr>
+              <w:spacing w:after="0" w:afterAutospacing="0"/>
+              <w:jc w:val="both"/>
+              <w:rPr>
+                <w:rFonts w:ascii="Tahoma" w:hAnsi="Tahoma" w:cs="Tahoma"/>
+                <w:bCs/>
+                <w:sz w:val="20"/>
+                <w:szCs w:val="20"/>
+              </w:rPr>
+            </w:pPr>
+            <w:r>
+              <w:rPr>
+                <w:rFonts w:ascii="Tahoma" w:hAnsi="Tahoma" w:cs="Tahoma"/>
+                <w:bCs/>
+                <w:sz w:val="20"/>
+                <w:szCs w:val="20"/>
+              </w:rPr>
+              <w:t>2.2.5: Arte y animaciones de enemigos</w:t>
+            </w:r>
+          </w:p>
+        </w:tc>
+        <w:tc>
+          <w:tcPr>
+            <w:tcW w:w="5228" w:type="dxa"/>
+          </w:tcPr>
+          <w:p>
+            <w:pPr>
+              <w:spacing w:after="0" w:afterAutospacing="0"/>
+              <w:jc w:val="both"/>
+              <w:rPr>
+                <w:rFonts w:ascii="Tahoma" w:hAnsi="Tahoma" w:cs="Tahoma"/>
+                <w:bCs/>
+                <w:sz w:val="20"/>
+                <w:szCs w:val="20"/>
+              </w:rPr>
+            </w:pPr>
+            <w:r>
+              <w:rPr>
+                <w:rFonts w:ascii="Tahoma" w:hAnsi="Tahoma" w:cs="Tahoma"/>
+                <w:bCs/>
+                <w:sz w:val="20"/>
+                <w:szCs w:val="20"/>
+              </w:rPr>
+              <w:t>750€</w:t>
+            </w:r>
+          </w:p>
+        </w:tc>
+      </w:tr>
+      <w:tr>
+        <w:tc>
+          <w:tcPr>
+            <w:tcW w:w="5228" w:type="dxa"/>
+          </w:tcPr>
+          <w:p>
+            <w:pPr>
+              <w:spacing w:after="0" w:afterAutospacing="0"/>
+              <w:jc w:val="both"/>
+              <w:rPr>
+                <w:rFonts w:ascii="Tahoma" w:hAnsi="Tahoma" w:cs="Tahoma"/>
+                <w:bCs/>
+                <w:sz w:val="20"/>
+                <w:szCs w:val="20"/>
+              </w:rPr>
+            </w:pPr>
+            <w:r>
+              <w:rPr>
+                <w:rFonts w:ascii="Tahoma" w:hAnsi="Tahoma" w:cs="Tahoma"/>
+                <w:bCs/>
+                <w:sz w:val="20"/>
+                <w:szCs w:val="20"/>
+              </w:rPr>
+              <w:t>2.3.1: Diseño mecánico</w:t>
+            </w:r>
+          </w:p>
+        </w:tc>
+        <w:tc>
+          <w:tcPr>
+            <w:tcW w:w="5228" w:type="dxa"/>
+          </w:tcPr>
+          <w:p>
+            <w:pPr>
+              <w:spacing w:after="0" w:afterAutospacing="0"/>
+              <w:jc w:val="both"/>
+              <w:rPr>
+                <w:rFonts w:ascii="Tahoma" w:hAnsi="Tahoma" w:cs="Tahoma"/>
+                <w:bCs/>
+                <w:sz w:val="20"/>
+                <w:szCs w:val="20"/>
+              </w:rPr>
+            </w:pPr>
+            <w:r>
+              <w:rPr>
+                <w:rFonts w:ascii="Tahoma" w:hAnsi="Tahoma" w:cs="Tahoma"/>
+                <w:bCs/>
+                <w:sz w:val="20"/>
+                <w:szCs w:val="20"/>
+              </w:rPr>
+              <w:t>360€</w:t>
+            </w:r>
+          </w:p>
+        </w:tc>
+      </w:tr>
+      <w:tr>
+        <w:tc>
+          <w:tcPr>
+            <w:tcW w:w="5228" w:type="dxa"/>
+          </w:tcPr>
+          <w:p>
+            <w:pPr>
+              <w:spacing w:after="0" w:afterAutospacing="0"/>
+              <w:jc w:val="both"/>
+              <w:rPr>
+                <w:rFonts w:ascii="Tahoma" w:hAnsi="Tahoma" w:cs="Tahoma"/>
+                <w:bCs/>
+                <w:sz w:val="20"/>
+                <w:szCs w:val="20"/>
+              </w:rPr>
+            </w:pPr>
+            <w:r>
+              <w:rPr>
+                <w:rFonts w:ascii="Tahoma" w:hAnsi="Tahoma" w:cs="Tahoma"/>
+                <w:bCs/>
+                <w:sz w:val="20"/>
+                <w:szCs w:val="20"/>
+              </w:rPr>
+              <w:t>2.3.2: Implementación del modelo de IA</w:t>
+            </w:r>
+          </w:p>
+        </w:tc>
+        <w:tc>
+          <w:tcPr>
+            <w:tcW w:w="5228" w:type="dxa"/>
+          </w:tcPr>
+          <w:p>
+            <w:pPr>
+              <w:spacing w:after="0" w:afterAutospacing="0"/>
+              <w:jc w:val="both"/>
+              <w:rPr>
+                <w:rFonts w:ascii="Tahoma" w:hAnsi="Tahoma" w:cs="Tahoma"/>
+                <w:bCs/>
+                <w:sz w:val="20"/>
+                <w:szCs w:val="20"/>
+              </w:rPr>
+            </w:pPr>
+            <w:r>
+              <w:rPr>
+                <w:rFonts w:ascii="Tahoma" w:hAnsi="Tahoma" w:cs="Tahoma"/>
+                <w:bCs/>
+                <w:sz w:val="20"/>
+                <w:szCs w:val="20"/>
+              </w:rPr>
+              <w:t>945€</w:t>
+            </w:r>
+          </w:p>
+        </w:tc>
+      </w:tr>
+      <w:tr>
+        <w:tc>
+          <w:tcPr>
+            <w:tcW w:w="5228" w:type="dxa"/>
+          </w:tcPr>
+          <w:p>
+            <w:pPr>
+              <w:spacing w:after="0" w:afterAutospacing="0"/>
+              <w:jc w:val="both"/>
+              <w:rPr>
+                <w:rFonts w:ascii="Tahoma" w:hAnsi="Tahoma" w:cs="Tahoma"/>
+                <w:bCs/>
+                <w:sz w:val="20"/>
+                <w:szCs w:val="20"/>
+              </w:rPr>
+            </w:pPr>
+            <w:r>
+              <w:rPr>
+                <w:rFonts w:ascii="Tahoma" w:hAnsi="Tahoma" w:cs="Tahoma"/>
+                <w:bCs/>
+                <w:sz w:val="20"/>
+                <w:szCs w:val="20"/>
+              </w:rPr>
+              <w:t>2.3.3: Sistema de evolución</w:t>
+            </w:r>
+          </w:p>
+        </w:tc>
+        <w:tc>
+          <w:tcPr>
+            <w:tcW w:w="5228" w:type="dxa"/>
+          </w:tcPr>
+          <w:p>
+            <w:pPr>
+              <w:spacing w:after="0" w:afterAutospacing="0"/>
+              <w:jc w:val="both"/>
+              <w:rPr>
+                <w:rFonts w:ascii="Tahoma" w:hAnsi="Tahoma" w:cs="Tahoma"/>
+                <w:bCs/>
+                <w:sz w:val="20"/>
+                <w:szCs w:val="20"/>
+              </w:rPr>
+            </w:pPr>
+            <w:r>
+              <w:rPr>
+                <w:rFonts w:ascii="Tahoma" w:hAnsi="Tahoma" w:cs="Tahoma"/>
+                <w:bCs/>
+                <w:sz w:val="20"/>
+                <w:szCs w:val="20"/>
+              </w:rPr>
+              <w:t>4</w:t>
+            </w:r>
+            <w:r>
+              <w:rPr>
+                <w:rFonts w:ascii="Tahoma" w:hAnsi="Tahoma" w:cs="Tahoma"/>
+                <w:bCs/>
+                <w:sz w:val="20"/>
+                <w:szCs w:val="20"/>
+              </w:rPr>
+              <w:t>2</w:t>
+            </w:r>
+            <w:r>
+              <w:rPr>
+                <w:rFonts w:ascii="Tahoma" w:hAnsi="Tahoma" w:cs="Tahoma"/>
+                <w:bCs/>
+                <w:sz w:val="20"/>
+                <w:szCs w:val="20"/>
+              </w:rPr>
+              <w:t>0€</w:t>
+            </w:r>
+          </w:p>
+        </w:tc>
+      </w:tr>
+      <w:tr>
+        <w:tc>
+          <w:tcPr>
+            <w:tcW w:w="5228" w:type="dxa"/>
+          </w:tcPr>
+          <w:p>
+            <w:pPr>
+              <w:spacing w:after="0" w:afterAutospacing="0"/>
+              <w:jc w:val="both"/>
+              <w:rPr>
+                <w:rFonts w:ascii="Tahoma" w:hAnsi="Tahoma" w:cs="Tahoma"/>
+                <w:bCs/>
+                <w:sz w:val="20"/>
+                <w:szCs w:val="20"/>
+              </w:rPr>
+            </w:pPr>
+            <w:r>
+              <w:rPr>
+                <w:rFonts w:ascii="Tahoma" w:hAnsi="Tahoma" w:cs="Tahoma"/>
+                <w:bCs/>
+                <w:sz w:val="20"/>
+                <w:szCs w:val="20"/>
+              </w:rPr>
+              <w:t>2.3.4: Arte y animaciones del mini-jefe</w:t>
+            </w:r>
+          </w:p>
+        </w:tc>
+        <w:tc>
+          <w:tcPr>
+            <w:tcW w:w="5228" w:type="dxa"/>
+          </w:tcPr>
+          <w:p>
+            <w:pPr>
+              <w:spacing w:after="0" w:afterAutospacing="0"/>
+              <w:jc w:val="both"/>
+              <w:rPr>
+                <w:rFonts w:ascii="Tahoma" w:hAnsi="Tahoma" w:cs="Tahoma"/>
+                <w:bCs/>
+                <w:sz w:val="20"/>
+                <w:szCs w:val="20"/>
+              </w:rPr>
+            </w:pPr>
+            <w:r>
+              <w:rPr>
+                <w:rFonts w:ascii="Tahoma" w:hAnsi="Tahoma" w:cs="Tahoma"/>
+                <w:bCs/>
+                <w:sz w:val="20"/>
+                <w:szCs w:val="20"/>
+              </w:rPr>
+              <w:t>425€</w:t>
+            </w:r>
+          </w:p>
+        </w:tc>
+      </w:tr>
+      <w:tr>
+        <w:tc>
+          <w:tcPr>
+            <w:tcW w:w="5228" w:type="dxa"/>
+          </w:tcPr>
+          <w:p>
+            <w:pPr>
+              <w:spacing w:after="0" w:afterAutospacing="0"/>
+              <w:jc w:val="both"/>
+              <w:rPr>
+                <w:rFonts w:ascii="Tahoma" w:hAnsi="Tahoma" w:cs="Tahoma"/>
+                <w:bCs/>
+                <w:sz w:val="20"/>
+                <w:szCs w:val="20"/>
+              </w:rPr>
+            </w:pPr>
+            <w:r>
+              <w:rPr>
+                <w:rFonts w:ascii="Tahoma" w:hAnsi="Tahoma" w:cs="Tahoma"/>
+                <w:bCs/>
+                <w:sz w:val="20"/>
+                <w:szCs w:val="20"/>
+              </w:rPr>
+              <w:t>2.4.1: Diseño de patrones</w:t>
+            </w:r>
+          </w:p>
+        </w:tc>
+        <w:tc>
+          <w:tcPr>
+            <w:tcW w:w="5228" w:type="dxa"/>
+          </w:tcPr>
+          <w:p>
+            <w:pPr>
+              <w:spacing w:after="0" w:afterAutospacing="0"/>
+              <w:jc w:val="both"/>
+              <w:rPr>
+                <w:rFonts w:ascii="Tahoma" w:hAnsi="Tahoma" w:cs="Tahoma"/>
+                <w:bCs/>
+                <w:sz w:val="20"/>
+                <w:szCs w:val="20"/>
+              </w:rPr>
+            </w:pPr>
+            <w:r>
+              <w:rPr>
+                <w:rFonts w:ascii="Tahoma" w:hAnsi="Tahoma" w:cs="Tahoma"/>
+                <w:bCs/>
+                <w:sz w:val="20"/>
+                <w:szCs w:val="20"/>
+              </w:rPr>
+              <w:t>225€</w:t>
+            </w:r>
+          </w:p>
+        </w:tc>
+      </w:tr>
+      <w:tr>
+        <w:tc>
+          <w:tcPr>
+            <w:tcW w:w="5228" w:type="dxa"/>
+          </w:tcPr>
+          <w:p>
+            <w:pPr>
+              <w:spacing w:after="0" w:afterAutospacing="0"/>
+              <w:jc w:val="both"/>
+              <w:rPr>
+                <w:rFonts w:ascii="Tahoma" w:hAnsi="Tahoma" w:cs="Tahoma"/>
+                <w:bCs/>
+                <w:sz w:val="20"/>
+                <w:szCs w:val="20"/>
+              </w:rPr>
+            </w:pPr>
+            <w:r>
+              <w:rPr>
+                <w:rFonts w:ascii="Tahoma" w:hAnsi="Tahoma" w:cs="Tahoma"/>
+                <w:bCs/>
+                <w:sz w:val="20"/>
+                <w:szCs w:val="20"/>
+              </w:rPr>
+              <w:t>2.4.2: Programación de comportamiento</w:t>
+            </w:r>
+          </w:p>
+        </w:tc>
+        <w:tc>
+          <w:tcPr>
+            <w:tcW w:w="5228" w:type="dxa"/>
+          </w:tcPr>
+          <w:p>
+            <w:pPr>
+              <w:spacing w:after="0" w:afterAutospacing="0"/>
+              <w:jc w:val="both"/>
+              <w:rPr>
+                <w:rFonts w:ascii="Tahoma" w:hAnsi="Tahoma" w:cs="Tahoma"/>
+                <w:bCs/>
+                <w:sz w:val="20"/>
+                <w:szCs w:val="20"/>
+              </w:rPr>
+            </w:pPr>
+            <w:r>
+              <w:rPr>
+                <w:rFonts w:ascii="Tahoma" w:hAnsi="Tahoma" w:cs="Tahoma"/>
+                <w:bCs/>
+                <w:sz w:val="20"/>
+                <w:szCs w:val="20"/>
+              </w:rPr>
+              <w:t>966€</w:t>
+            </w:r>
+          </w:p>
+        </w:tc>
+      </w:tr>
+      <w:tr>
+        <w:tc>
+          <w:tcPr>
+            <w:tcW w:w="5228" w:type="dxa"/>
+          </w:tcPr>
+          <w:p>
+            <w:pPr>
+              <w:spacing w:after="0" w:afterAutospacing="0"/>
+              <w:jc w:val="both"/>
+              <w:rPr>
+                <w:rFonts w:ascii="Tahoma" w:hAnsi="Tahoma" w:cs="Tahoma"/>
+                <w:bCs/>
+                <w:sz w:val="20"/>
+                <w:szCs w:val="20"/>
+              </w:rPr>
+            </w:pPr>
+            <w:r>
+              <w:rPr>
+                <w:rFonts w:ascii="Tahoma" w:hAnsi="Tahoma" w:cs="Tahoma"/>
+                <w:bCs/>
+                <w:sz w:val="20"/>
+                <w:szCs w:val="20"/>
+              </w:rPr>
+              <w:t>2.4.3: Sistema de puntos débiles</w:t>
+            </w:r>
+          </w:p>
+        </w:tc>
+        <w:tc>
+          <w:tcPr>
+            <w:tcW w:w="5228" w:type="dxa"/>
+          </w:tcPr>
+          <w:p>
+            <w:pPr>
+              <w:spacing w:after="0" w:afterAutospacing="0"/>
+              <w:jc w:val="both"/>
+              <w:rPr>
+                <w:rFonts w:ascii="Tahoma" w:hAnsi="Tahoma" w:cs="Tahoma"/>
+                <w:bCs/>
+                <w:sz w:val="20"/>
+                <w:szCs w:val="20"/>
+              </w:rPr>
+            </w:pPr>
+            <w:r>
+              <w:rPr>
+                <w:rFonts w:ascii="Tahoma" w:hAnsi="Tahoma" w:cs="Tahoma"/>
+                <w:bCs/>
+                <w:sz w:val="20"/>
+                <w:szCs w:val="20"/>
+              </w:rPr>
+              <w:t>189€</w:t>
+            </w:r>
+          </w:p>
+        </w:tc>
+      </w:tr>
+      <w:tr>
+        <w:tc>
+          <w:tcPr>
+            <w:tcW w:w="5228" w:type="dxa"/>
+          </w:tcPr>
+          <w:p>
+            <w:pPr>
+              <w:spacing w:after="0" w:afterAutospacing="0"/>
+              <w:jc w:val="both"/>
+              <w:rPr>
+                <w:rFonts w:ascii="Tahoma" w:hAnsi="Tahoma" w:cs="Tahoma"/>
+                <w:bCs/>
+                <w:sz w:val="20"/>
+                <w:szCs w:val="20"/>
+              </w:rPr>
+            </w:pPr>
+            <w:r>
+              <w:rPr>
+                <w:rFonts w:ascii="Tahoma" w:hAnsi="Tahoma" w:cs="Tahoma"/>
+                <w:bCs/>
+                <w:sz w:val="20"/>
+                <w:szCs w:val="20"/>
+              </w:rPr>
+              <w:t>2.4.4: Arte y animaciones de los jefes</w:t>
+            </w:r>
+          </w:p>
+        </w:tc>
+        <w:tc>
+          <w:tcPr>
+            <w:tcW w:w="5228" w:type="dxa"/>
+          </w:tcPr>
+          <w:p>
+            <w:pPr>
+              <w:spacing w:after="0" w:afterAutospacing="0"/>
+              <w:jc w:val="both"/>
+              <w:rPr>
+                <w:rFonts w:ascii="Tahoma" w:hAnsi="Tahoma" w:cs="Tahoma"/>
+                <w:bCs/>
+                <w:sz w:val="20"/>
+                <w:szCs w:val="20"/>
+              </w:rPr>
+            </w:pPr>
+            <w:r>
+              <w:rPr>
+                <w:rFonts w:ascii="Tahoma" w:hAnsi="Tahoma" w:cs="Tahoma"/>
+                <w:bCs/>
+                <w:sz w:val="20"/>
+                <w:szCs w:val="20"/>
+              </w:rPr>
+              <w:t>672€</w:t>
+            </w:r>
+          </w:p>
+        </w:tc>
+      </w:tr>
+      <w:tr>
+        <w:tc>
+          <w:tcPr>
+            <w:tcW w:w="5228" w:type="dxa"/>
+          </w:tcPr>
+          <w:p>
+            <w:pPr>
+              <w:spacing w:after="0" w:afterAutospacing="0"/>
+              <w:jc w:val="both"/>
+              <w:rPr>
+                <w:rFonts w:ascii="Tahoma" w:hAnsi="Tahoma" w:cs="Tahoma"/>
+                <w:bCs/>
+                <w:sz w:val="20"/>
+                <w:szCs w:val="20"/>
+              </w:rPr>
+            </w:pPr>
+            <w:r>
+              <w:rPr>
+                <w:rFonts w:ascii="Tahoma" w:hAnsi="Tahoma" w:cs="Tahoma"/>
+                <w:bCs/>
+                <w:sz w:val="20"/>
+                <w:szCs w:val="20"/>
+              </w:rPr>
+              <w:t>2.5.1: Diseño de Layout</w:t>
+            </w:r>
+          </w:p>
+        </w:tc>
+        <w:tc>
+          <w:tcPr>
+            <w:tcW w:w="5228" w:type="dxa"/>
+          </w:tcPr>
+          <w:p>
+            <w:pPr>
+              <w:spacing w:after="0" w:afterAutospacing="0"/>
+              <w:jc w:val="both"/>
+              <w:rPr>
+                <w:rFonts w:ascii="Tahoma" w:hAnsi="Tahoma" w:cs="Tahoma"/>
+                <w:bCs/>
+                <w:sz w:val="20"/>
+                <w:szCs w:val="20"/>
+              </w:rPr>
+            </w:pPr>
+            <w:r>
+              <w:rPr>
+                <w:rFonts w:ascii="Tahoma" w:hAnsi="Tahoma" w:cs="Tahoma"/>
+                <w:bCs/>
+                <w:sz w:val="20"/>
+                <w:szCs w:val="20"/>
+              </w:rPr>
+              <w:t>450€</w:t>
+            </w:r>
+          </w:p>
+        </w:tc>
+      </w:tr>
+      <w:tr>
+        <w:tc>
+          <w:tcPr>
+            <w:tcW w:w="5228" w:type="dxa"/>
+          </w:tcPr>
+          <w:p>
+            <w:pPr>
+              <w:spacing w:after="0" w:afterAutospacing="0"/>
+              <w:jc w:val="both"/>
+              <w:rPr>
+                <w:rFonts w:ascii="Tahoma" w:hAnsi="Tahoma" w:cs="Tahoma"/>
+                <w:bCs/>
+                <w:sz w:val="20"/>
+                <w:szCs w:val="20"/>
+              </w:rPr>
+            </w:pPr>
+            <w:r>
+              <w:rPr>
+                <w:rFonts w:ascii="Tahoma" w:hAnsi="Tahoma" w:cs="Tahoma"/>
+                <w:bCs/>
+                <w:sz w:val="20"/>
+                <w:szCs w:val="20"/>
+              </w:rPr>
+              <w:t>2.5.2: Implementación de tilemaps</w:t>
+            </w:r>
+          </w:p>
+        </w:tc>
+        <w:tc>
+          <w:tcPr>
+            <w:tcW w:w="5228" w:type="dxa"/>
+          </w:tcPr>
+          <w:p>
+            <w:pPr>
+              <w:spacing w:after="0" w:afterAutospacing="0"/>
+              <w:jc w:val="both"/>
+              <w:rPr>
+                <w:rFonts w:ascii="Tahoma" w:hAnsi="Tahoma" w:cs="Tahoma"/>
+                <w:bCs/>
+                <w:sz w:val="20"/>
+                <w:szCs w:val="20"/>
+              </w:rPr>
+            </w:pPr>
+            <w:r>
+              <w:rPr>
+                <w:rFonts w:ascii="Tahoma" w:hAnsi="Tahoma" w:cs="Tahoma"/>
+                <w:bCs/>
+                <w:sz w:val="20"/>
+                <w:szCs w:val="20"/>
+              </w:rPr>
+              <w:t>630€</w:t>
+            </w:r>
+          </w:p>
+        </w:tc>
+      </w:tr>
+      <w:tr>
+        <w:tc>
+          <w:tcPr>
+            <w:tcW w:w="5228" w:type="dxa"/>
+          </w:tcPr>
+          <w:p>
+            <w:pPr>
+              <w:spacing w:after="0" w:afterAutospacing="0"/>
+              <w:jc w:val="both"/>
+              <w:rPr>
+                <w:rFonts w:ascii="Tahoma" w:hAnsi="Tahoma" w:cs="Tahoma"/>
+                <w:bCs/>
+                <w:sz w:val="20"/>
+                <w:szCs w:val="20"/>
+              </w:rPr>
+            </w:pPr>
+            <w:r>
+              <w:rPr>
+                <w:rFonts w:ascii="Tahoma" w:hAnsi="Tahoma" w:cs="Tahoma"/>
+                <w:bCs/>
+                <w:sz w:val="20"/>
+                <w:szCs w:val="20"/>
+              </w:rPr>
+              <w:t>2.5.3: Integración de enemigos y jefes</w:t>
+            </w:r>
+          </w:p>
+        </w:tc>
+        <w:tc>
+          <w:tcPr>
+            <w:tcW w:w="5228" w:type="dxa"/>
+          </w:tcPr>
+          <w:p>
+            <w:pPr>
+              <w:spacing w:after="0" w:afterAutospacing="0"/>
+              <w:jc w:val="both"/>
+              <w:rPr>
+                <w:rFonts w:ascii="Tahoma" w:hAnsi="Tahoma" w:cs="Tahoma"/>
+                <w:bCs/>
+                <w:sz w:val="20"/>
+                <w:szCs w:val="20"/>
+              </w:rPr>
+            </w:pPr>
+            <w:r>
+              <w:rPr>
+                <w:rFonts w:ascii="Tahoma" w:hAnsi="Tahoma" w:cs="Tahoma"/>
+                <w:bCs/>
+                <w:sz w:val="20"/>
+                <w:szCs w:val="20"/>
+              </w:rPr>
+              <w:t>231€</w:t>
+            </w:r>
+          </w:p>
+        </w:tc>
+      </w:tr>
+      <w:tr>
+        <w:tc>
+          <w:tcPr>
+            <w:tcW w:w="5228" w:type="dxa"/>
+          </w:tcPr>
+          <w:p>
+            <w:pPr>
+              <w:spacing w:after="0" w:afterAutospacing="0"/>
+              <w:jc w:val="both"/>
+              <w:rPr>
+                <w:rFonts w:ascii="Tahoma" w:hAnsi="Tahoma" w:cs="Tahoma"/>
+                <w:bCs/>
+                <w:sz w:val="20"/>
+                <w:szCs w:val="20"/>
+              </w:rPr>
+            </w:pPr>
+            <w:r>
+              <w:rPr>
+                <w:rFonts w:ascii="Tahoma" w:hAnsi="Tahoma" w:cs="Tahoma"/>
+                <w:bCs/>
+                <w:sz w:val="20"/>
+                <w:szCs w:val="20"/>
+              </w:rPr>
+              <w:t>2.5.4: Implementación de objetos y obstáculos</w:t>
+            </w:r>
+          </w:p>
+        </w:tc>
+        <w:tc>
+          <w:tcPr>
+            <w:tcW w:w="5228" w:type="dxa"/>
+          </w:tcPr>
+          <w:p>
+            <w:pPr>
+              <w:spacing w:after="0" w:afterAutospacing="0"/>
+              <w:jc w:val="both"/>
+              <w:rPr>
+                <w:rFonts w:ascii="Tahoma" w:hAnsi="Tahoma" w:cs="Tahoma"/>
+                <w:bCs/>
+                <w:sz w:val="20"/>
+                <w:szCs w:val="20"/>
+              </w:rPr>
+            </w:pPr>
+            <w:r>
+              <w:rPr>
+                <w:rFonts w:ascii="Tahoma" w:hAnsi="Tahoma" w:cs="Tahoma"/>
+                <w:bCs/>
+                <w:sz w:val="20"/>
+                <w:szCs w:val="20"/>
+              </w:rPr>
+              <w:t>336€</w:t>
+            </w:r>
+          </w:p>
+        </w:tc>
+      </w:tr>
+      <w:tr>
+        <w:tc>
+          <w:tcPr>
+            <w:tcW w:w="5228" w:type="dxa"/>
+          </w:tcPr>
+          <w:p>
+            <w:pPr>
+              <w:spacing w:after="0" w:afterAutospacing="0"/>
+              <w:jc w:val="both"/>
+              <w:rPr>
+                <w:rFonts w:ascii="Tahoma" w:hAnsi="Tahoma" w:cs="Tahoma"/>
+                <w:bCs/>
+                <w:sz w:val="20"/>
+                <w:szCs w:val="20"/>
+              </w:rPr>
+            </w:pPr>
+            <w:r>
+              <w:rPr>
+                <w:rFonts w:ascii="Tahoma" w:hAnsi="Tahoma" w:cs="Tahoma"/>
+                <w:bCs/>
+                <w:sz w:val="20"/>
+                <w:szCs w:val="20"/>
+              </w:rPr>
+              <w:t>2.5.5: Arte y animación del entorno</w:t>
+            </w:r>
+          </w:p>
+        </w:tc>
+        <w:tc>
+          <w:tcPr>
+            <w:tcW w:w="5228" w:type="dxa"/>
+          </w:tcPr>
+          <w:p>
+            <w:pPr>
+              <w:spacing w:after="0" w:afterAutospacing="0"/>
+              <w:jc w:val="both"/>
+              <w:rPr>
+                <w:rFonts w:ascii="Tahoma" w:hAnsi="Tahoma" w:cs="Tahoma"/>
+                <w:bCs/>
+                <w:sz w:val="20"/>
+                <w:szCs w:val="20"/>
+              </w:rPr>
+            </w:pPr>
+            <w:r>
+              <w:rPr>
+                <w:rFonts w:ascii="Tahoma" w:hAnsi="Tahoma" w:cs="Tahoma"/>
+                <w:bCs/>
+                <w:sz w:val="20"/>
+                <w:szCs w:val="20"/>
+              </w:rPr>
+              <w:t>750€</w:t>
+            </w:r>
+          </w:p>
+        </w:tc>
+      </w:tr>
+      <w:tr>
+        <w:tc>
+          <w:tcPr>
+            <w:tcW w:w="5228" w:type="dxa"/>
+          </w:tcPr>
+          <w:p>
+            <w:pPr>
+              <w:spacing w:after="0" w:afterAutospacing="0"/>
+              <w:jc w:val="both"/>
+              <w:rPr>
+                <w:rFonts w:ascii="Tahoma" w:hAnsi="Tahoma" w:cs="Tahoma"/>
+                <w:bCs/>
+                <w:sz w:val="20"/>
+                <w:szCs w:val="20"/>
+              </w:rPr>
+            </w:pPr>
+            <w:r>
+              <w:rPr>
+                <w:rFonts w:ascii="Tahoma" w:hAnsi="Tahoma" w:cs="Tahoma"/>
+                <w:bCs/>
+                <w:sz w:val="20"/>
+                <w:szCs w:val="20"/>
+              </w:rPr>
+              <w:t>3.1.1: HUD</w:t>
+            </w:r>
+          </w:p>
+        </w:tc>
+        <w:tc>
+          <w:tcPr>
+            <w:tcW w:w="5228" w:type="dxa"/>
+          </w:tcPr>
+          <w:p>
+            <w:pPr>
+              <w:spacing w:after="0" w:afterAutospacing="0"/>
+              <w:jc w:val="both"/>
+              <w:rPr>
+                <w:rFonts w:ascii="Tahoma" w:hAnsi="Tahoma" w:cs="Tahoma"/>
+                <w:bCs/>
+                <w:sz w:val="20"/>
+                <w:szCs w:val="20"/>
+              </w:rPr>
+            </w:pPr>
+            <w:r>
+              <w:rPr>
+                <w:rFonts w:ascii="Tahoma" w:hAnsi="Tahoma" w:cs="Tahoma"/>
+                <w:bCs/>
+                <w:sz w:val="20"/>
+                <w:szCs w:val="20"/>
+              </w:rPr>
+              <w:t>336€</w:t>
+            </w:r>
+          </w:p>
+        </w:tc>
+      </w:tr>
+      <w:tr>
+        <w:tc>
+          <w:tcPr>
+            <w:tcW w:w="5228" w:type="dxa"/>
+          </w:tcPr>
+          <w:p>
+            <w:pPr>
+              <w:spacing w:after="0" w:afterAutospacing="0"/>
+              <w:jc w:val="both"/>
+              <w:rPr>
+                <w:rFonts w:ascii="Tahoma" w:hAnsi="Tahoma" w:cs="Tahoma"/>
+                <w:bCs/>
+                <w:sz w:val="20"/>
+                <w:szCs w:val="20"/>
+              </w:rPr>
+            </w:pPr>
+            <w:r>
+              <w:rPr>
+                <w:rFonts w:ascii="Tahoma" w:hAnsi="Tahoma" w:cs="Tahoma"/>
+                <w:bCs/>
+                <w:sz w:val="20"/>
+                <w:szCs w:val="20"/>
+              </w:rPr>
+              <w:t>3.1.2: Pantal</w:t>
+            </w:r>
+            <w:r>
+              <w:rPr>
+                <w:rFonts w:ascii="Tahoma" w:hAnsi="Tahoma" w:cs="Tahoma"/>
+                <w:bCs/>
+                <w:sz w:val="20"/>
+                <w:szCs w:val="20"/>
+              </w:rPr>
+              <w:t>la</w:t>
+            </w:r>
+            <w:r>
+              <w:rPr>
+                <w:rFonts w:ascii="Tahoma" w:hAnsi="Tahoma" w:cs="Tahoma"/>
+                <w:bCs/>
+                <w:sz w:val="20"/>
+                <w:szCs w:val="20"/>
+              </w:rPr>
+              <w:t xml:space="preserve"> de inici</w:t>
+            </w:r>
+            <w:r>
+              <w:rPr>
+                <w:rFonts w:ascii="Tahoma" w:hAnsi="Tahoma" w:cs="Tahoma"/>
+                <w:bCs/>
+                <w:sz w:val="20"/>
+                <w:szCs w:val="20"/>
+              </w:rPr>
+              <w:t>o</w:t>
+            </w:r>
+          </w:p>
+        </w:tc>
+        <w:tc>
+          <w:tcPr>
+            <w:tcW w:w="5228" w:type="dxa"/>
+          </w:tcPr>
+          <w:p>
+            <w:pPr>
+              <w:spacing w:after="0" w:afterAutospacing="0"/>
+              <w:jc w:val="both"/>
+              <w:rPr>
+                <w:rFonts w:ascii="Tahoma" w:hAnsi="Tahoma" w:cs="Tahoma"/>
+                <w:bCs/>
+                <w:sz w:val="20"/>
+                <w:szCs w:val="20"/>
+              </w:rPr>
+            </w:pPr>
+            <w:r>
+              <w:rPr>
+                <w:rFonts w:ascii="Tahoma" w:hAnsi="Tahoma" w:cs="Tahoma"/>
+                <w:bCs/>
+                <w:sz w:val="20"/>
+                <w:szCs w:val="20"/>
+              </w:rPr>
+              <w:t>226€</w:t>
+            </w:r>
+          </w:p>
+        </w:tc>
+      </w:tr>
+      <w:tr>
+        <w:tc>
+          <w:tcPr>
+            <w:tcW w:w="5228" w:type="dxa"/>
+          </w:tcPr>
+          <w:p>
+            <w:pPr>
+              <w:spacing w:after="0" w:afterAutospacing="0"/>
+              <w:jc w:val="both"/>
+              <w:rPr>
+                <w:rFonts w:ascii="Tahoma" w:hAnsi="Tahoma" w:cs="Tahoma"/>
+                <w:bCs/>
+                <w:sz w:val="20"/>
+                <w:szCs w:val="20"/>
+              </w:rPr>
+            </w:pPr>
+            <w:r>
+              <w:rPr>
+                <w:rFonts w:ascii="Tahoma" w:hAnsi="Tahoma" w:cs="Tahoma"/>
+                <w:bCs/>
+                <w:sz w:val="20"/>
+                <w:szCs w:val="20"/>
+              </w:rPr>
+              <w:t>3.1.3: Pantalla de pausa</w:t>
+            </w:r>
+          </w:p>
+        </w:tc>
+        <w:tc>
+          <w:tcPr>
+            <w:tcW w:w="5228" w:type="dxa"/>
+          </w:tcPr>
+          <w:p>
+            <w:pPr>
+              <w:spacing w:after="0" w:afterAutospacing="0"/>
+              <w:jc w:val="both"/>
+              <w:rPr>
+                <w:rFonts w:ascii="Tahoma" w:hAnsi="Tahoma" w:cs="Tahoma"/>
+                <w:bCs/>
+                <w:sz w:val="20"/>
+                <w:szCs w:val="20"/>
+              </w:rPr>
+            </w:pPr>
+            <w:r>
+              <w:rPr>
+                <w:rFonts w:ascii="Tahoma" w:hAnsi="Tahoma" w:cs="Tahoma"/>
+                <w:bCs/>
+                <w:sz w:val="20"/>
+                <w:szCs w:val="20"/>
+              </w:rPr>
+              <w:t>268€</w:t>
+            </w:r>
+          </w:p>
+        </w:tc>
+      </w:tr>
+      <w:tr>
+        <w:tc>
+          <w:tcPr>
+            <w:tcW w:w="5228" w:type="dxa"/>
+          </w:tcPr>
+          <w:p>
+            <w:pPr>
+              <w:spacing w:after="0" w:afterAutospacing="0"/>
+              <w:jc w:val="both"/>
+              <w:rPr>
+                <w:rFonts w:ascii="Tahoma" w:hAnsi="Tahoma" w:cs="Tahoma"/>
+                <w:bCs/>
+                <w:sz w:val="20"/>
+                <w:szCs w:val="20"/>
+              </w:rPr>
+            </w:pPr>
+            <w:r>
+              <w:rPr>
+                <w:rFonts w:ascii="Tahoma" w:hAnsi="Tahoma" w:cs="Tahoma"/>
+                <w:bCs/>
+                <w:sz w:val="20"/>
+                <w:szCs w:val="20"/>
+              </w:rPr>
+              <w:t>3.1.4: Pantalla de ajustes</w:t>
+            </w:r>
+          </w:p>
+        </w:tc>
+        <w:tc>
+          <w:tcPr>
+            <w:tcW w:w="5228" w:type="dxa"/>
+          </w:tcPr>
+          <w:p>
+            <w:pPr>
+              <w:spacing w:after="0" w:afterAutospacing="0"/>
+              <w:jc w:val="both"/>
+              <w:rPr>
+                <w:rFonts w:ascii="Tahoma" w:hAnsi="Tahoma" w:cs="Tahoma"/>
+                <w:bCs/>
+                <w:sz w:val="20"/>
+                <w:szCs w:val="20"/>
+              </w:rPr>
+            </w:pPr>
+            <w:r>
+              <w:rPr>
+                <w:rFonts w:ascii="Tahoma" w:hAnsi="Tahoma" w:cs="Tahoma"/>
+                <w:bCs/>
+                <w:sz w:val="20"/>
+                <w:szCs w:val="20"/>
+              </w:rPr>
+              <w:t>285€</w:t>
+            </w:r>
+          </w:p>
+        </w:tc>
+      </w:tr>
+      <w:tr>
+        <w:tc>
+          <w:tcPr>
+            <w:tcW w:w="5228" w:type="dxa"/>
+          </w:tcPr>
+          <w:p>
+            <w:pPr>
+              <w:spacing w:after="0" w:afterAutospacing="0"/>
+              <w:jc w:val="both"/>
+              <w:rPr>
+                <w:rFonts w:ascii="Tahoma" w:hAnsi="Tahoma" w:cs="Tahoma"/>
+                <w:bCs/>
+                <w:sz w:val="20"/>
+                <w:szCs w:val="20"/>
+              </w:rPr>
+            </w:pPr>
+            <w:r>
+              <w:rPr>
+                <w:rFonts w:ascii="Tahoma" w:hAnsi="Tahoma" w:cs="Tahoma"/>
+                <w:bCs/>
+                <w:sz w:val="20"/>
+                <w:szCs w:val="20"/>
+              </w:rPr>
+              <w:t>3.1.5: Pantalla de carga</w:t>
+            </w:r>
+          </w:p>
+        </w:tc>
+        <w:tc>
+          <w:tcPr>
+            <w:tcW w:w="5228" w:type="dxa"/>
+          </w:tcPr>
+          <w:p>
+            <w:pPr>
+              <w:spacing w:after="0" w:afterAutospacing="0"/>
+              <w:jc w:val="both"/>
+              <w:rPr>
+                <w:rFonts w:ascii="Tahoma" w:hAnsi="Tahoma" w:cs="Tahoma"/>
+                <w:bCs/>
+                <w:sz w:val="20"/>
+                <w:szCs w:val="20"/>
+              </w:rPr>
+            </w:pPr>
+            <w:r>
+              <w:rPr>
+                <w:rFonts w:ascii="Tahoma" w:hAnsi="Tahoma" w:cs="Tahoma"/>
+                <w:bCs/>
+                <w:sz w:val="20"/>
+                <w:szCs w:val="20"/>
+              </w:rPr>
+              <w:t>255€</w:t>
+            </w:r>
+          </w:p>
+        </w:tc>
+      </w:tr>
+      <w:tr>
+        <w:tc>
+          <w:tcPr>
+            <w:tcW w:w="5228" w:type="dxa"/>
+          </w:tcPr>
+          <w:p>
+            <w:pPr>
+              <w:spacing w:after="0" w:afterAutospacing="0"/>
+              <w:jc w:val="both"/>
+              <w:rPr>
+                <w:rFonts w:ascii="Tahoma" w:hAnsi="Tahoma" w:cs="Tahoma"/>
+                <w:bCs/>
+                <w:sz w:val="20"/>
+                <w:szCs w:val="20"/>
+              </w:rPr>
+            </w:pPr>
+            <w:r>
+              <w:rPr>
+                <w:rFonts w:ascii="Tahoma" w:hAnsi="Tahoma" w:cs="Tahoma"/>
+                <w:bCs/>
+                <w:sz w:val="20"/>
+                <w:szCs w:val="20"/>
+              </w:rPr>
+              <w:t xml:space="preserve">3.1.6: Pantalla de </w:t>
+            </w:r>
+            <w:r>
+              <w:rPr>
+                <w:rFonts w:ascii="Tahoma" w:hAnsi="Tahoma" w:cs="Tahoma"/>
+                <w:bCs/>
+                <w:sz w:val="20"/>
+                <w:szCs w:val="20"/>
+              </w:rPr>
+              <w:t>créditos</w:t>
+            </w:r>
+          </w:p>
+        </w:tc>
+        <w:tc>
+          <w:tcPr>
+            <w:tcW w:w="5228" w:type="dxa"/>
+          </w:tcPr>
+          <w:p>
+            <w:pPr>
+              <w:spacing w:after="0" w:afterAutospacing="0"/>
+              <w:jc w:val="both"/>
+              <w:rPr>
+                <w:rFonts w:ascii="Tahoma" w:hAnsi="Tahoma" w:cs="Tahoma"/>
+                <w:bCs/>
+                <w:sz w:val="20"/>
+                <w:szCs w:val="20"/>
+              </w:rPr>
+            </w:pPr>
+            <w:r>
+              <w:rPr>
+                <w:rFonts w:ascii="Tahoma" w:hAnsi="Tahoma" w:cs="Tahoma"/>
+                <w:bCs/>
+                <w:sz w:val="20"/>
+                <w:szCs w:val="20"/>
+              </w:rPr>
+              <w:t>1</w:t>
+            </w:r>
+            <w:r>
+              <w:rPr>
+                <w:rFonts w:ascii="Tahoma" w:hAnsi="Tahoma" w:cs="Tahoma"/>
+                <w:bCs/>
+                <w:sz w:val="20"/>
+                <w:szCs w:val="20"/>
+              </w:rPr>
+              <w:t>80€</w:t>
+            </w:r>
+          </w:p>
+        </w:tc>
+      </w:tr>
+      <w:tr>
+        <w:tc>
+          <w:tcPr>
+            <w:tcW w:w="5228" w:type="dxa"/>
+          </w:tcPr>
+          <w:p>
+            <w:pPr>
+              <w:spacing w:after="0" w:afterAutospacing="0"/>
+              <w:jc w:val="both"/>
+              <w:rPr>
+                <w:rFonts w:ascii="Tahoma" w:hAnsi="Tahoma" w:cs="Tahoma"/>
+                <w:bCs/>
+                <w:sz w:val="20"/>
+                <w:szCs w:val="20"/>
+              </w:rPr>
+            </w:pPr>
+            <w:r>
+              <w:rPr>
+                <w:rFonts w:ascii="Tahoma" w:hAnsi="Tahoma" w:cs="Tahoma"/>
+                <w:bCs/>
+                <w:sz w:val="20"/>
+                <w:szCs w:val="20"/>
+              </w:rPr>
+              <w:t>3.2.1: Sistema de guardado automático</w:t>
+            </w:r>
+          </w:p>
+        </w:tc>
+        <w:tc>
+          <w:tcPr>
+            <w:tcW w:w="5228" w:type="dxa"/>
+          </w:tcPr>
+          <w:p>
+            <w:pPr>
+              <w:spacing w:after="0" w:afterAutospacing="0"/>
+              <w:jc w:val="both"/>
+              <w:rPr>
+                <w:rFonts w:ascii="Tahoma" w:hAnsi="Tahoma" w:cs="Tahoma"/>
+                <w:bCs/>
+                <w:sz w:val="20"/>
+                <w:szCs w:val="20"/>
+              </w:rPr>
+            </w:pPr>
+            <w:r>
+              <w:rPr>
+                <w:rFonts w:ascii="Tahoma" w:hAnsi="Tahoma" w:cs="Tahoma"/>
+                <w:bCs/>
+                <w:sz w:val="20"/>
+                <w:szCs w:val="20"/>
+              </w:rPr>
+              <w:t>294€</w:t>
+            </w:r>
+          </w:p>
+        </w:tc>
+      </w:tr>
+      <w:tr>
+        <w:tc>
+          <w:tcPr>
+            <w:tcW w:w="5228" w:type="dxa"/>
+          </w:tcPr>
+          <w:p>
+            <w:pPr>
+              <w:spacing w:after="0" w:afterAutospacing="0"/>
+              <w:jc w:val="both"/>
+              <w:rPr>
+                <w:rFonts w:ascii="Tahoma" w:hAnsi="Tahoma" w:cs="Tahoma"/>
+                <w:bCs/>
+                <w:sz w:val="20"/>
+                <w:szCs w:val="20"/>
+              </w:rPr>
+            </w:pPr>
+            <w:r>
+              <w:rPr>
+                <w:rFonts w:ascii="Tahoma" w:hAnsi="Tahoma" w:cs="Tahoma"/>
+                <w:bCs/>
+                <w:sz w:val="20"/>
+                <w:szCs w:val="20"/>
+              </w:rPr>
+              <w:t>3.2.2: Sistemas de checkpoints</w:t>
+            </w:r>
+          </w:p>
+        </w:tc>
+        <w:tc>
+          <w:tcPr>
+            <w:tcW w:w="5228" w:type="dxa"/>
+          </w:tcPr>
+          <w:p>
+            <w:pPr>
+              <w:spacing w:after="0" w:afterAutospacing="0"/>
+              <w:jc w:val="both"/>
+              <w:rPr>
+                <w:rFonts w:ascii="Tahoma" w:hAnsi="Tahoma" w:cs="Tahoma"/>
+                <w:bCs/>
+                <w:sz w:val="20"/>
+                <w:szCs w:val="20"/>
+              </w:rPr>
+            </w:pPr>
+            <w:r>
+              <w:rPr>
+                <w:rFonts w:ascii="Tahoma" w:hAnsi="Tahoma" w:cs="Tahoma"/>
+                <w:bCs/>
+                <w:sz w:val="20"/>
+                <w:szCs w:val="20"/>
+              </w:rPr>
+              <w:t>252€</w:t>
+            </w:r>
+          </w:p>
+        </w:tc>
+      </w:tr>
+      <w:tr>
+        <w:tc>
+          <w:tcPr>
+            <w:tcW w:w="5228" w:type="dxa"/>
+          </w:tcPr>
+          <w:p>
+            <w:pPr>
+              <w:spacing w:after="0" w:afterAutospacing="0"/>
+              <w:jc w:val="both"/>
+              <w:rPr>
+                <w:rFonts w:ascii="Tahoma" w:hAnsi="Tahoma" w:cs="Tahoma"/>
+                <w:bCs/>
+                <w:sz w:val="20"/>
+                <w:szCs w:val="20"/>
+              </w:rPr>
+            </w:pPr>
+            <w:r>
+              <w:rPr>
+                <w:rFonts w:ascii="Tahoma" w:hAnsi="Tahoma" w:cs="Tahoma"/>
+                <w:bCs/>
+                <w:sz w:val="20"/>
+                <w:szCs w:val="20"/>
+              </w:rPr>
+              <w:t>3.2.3: Persistencia de habilidades</w:t>
+            </w:r>
+          </w:p>
+        </w:tc>
+        <w:tc>
+          <w:tcPr>
+            <w:tcW w:w="5228" w:type="dxa"/>
+          </w:tcPr>
+          <w:p>
+            <w:pPr>
+              <w:spacing w:after="0" w:afterAutospacing="0"/>
+              <w:jc w:val="both"/>
+              <w:rPr>
+                <w:rFonts w:ascii="Tahoma" w:hAnsi="Tahoma" w:cs="Tahoma"/>
+                <w:bCs/>
+                <w:sz w:val="20"/>
+                <w:szCs w:val="20"/>
+              </w:rPr>
+            </w:pPr>
+            <w:r>
+              <w:rPr>
+                <w:rFonts w:ascii="Tahoma" w:hAnsi="Tahoma" w:cs="Tahoma"/>
+                <w:bCs/>
+                <w:sz w:val="20"/>
+                <w:szCs w:val="20"/>
+              </w:rPr>
+              <w:t>168€</w:t>
+            </w:r>
+          </w:p>
+        </w:tc>
+      </w:tr>
+      <w:tr>
+        <w:tc>
+          <w:tcPr>
+            <w:tcW w:w="5228" w:type="dxa"/>
+          </w:tcPr>
+          <w:p>
+            <w:pPr>
+              <w:spacing w:after="0" w:afterAutospacing="0"/>
+              <w:jc w:val="both"/>
+              <w:rPr>
+                <w:rFonts w:ascii="Tahoma" w:hAnsi="Tahoma" w:cs="Tahoma"/>
+                <w:bCs/>
+                <w:sz w:val="20"/>
+                <w:szCs w:val="20"/>
+              </w:rPr>
+            </w:pPr>
+            <w:r>
+              <w:rPr>
+                <w:rFonts w:ascii="Tahoma" w:hAnsi="Tahoma" w:cs="Tahoma"/>
+                <w:bCs/>
+                <w:sz w:val="20"/>
+                <w:szCs w:val="20"/>
+              </w:rPr>
+              <w:t>3.2.4: Persistencia de progreso</w:t>
+            </w:r>
+          </w:p>
+        </w:tc>
+        <w:tc>
+          <w:tcPr>
+            <w:tcW w:w="5228" w:type="dxa"/>
+          </w:tcPr>
+          <w:p>
+            <w:pPr>
+              <w:spacing w:after="0" w:afterAutospacing="0"/>
+              <w:jc w:val="both"/>
+              <w:rPr>
+                <w:rFonts w:ascii="Tahoma" w:hAnsi="Tahoma" w:cs="Tahoma"/>
+                <w:bCs/>
+                <w:sz w:val="20"/>
+                <w:szCs w:val="20"/>
+              </w:rPr>
+            </w:pPr>
+            <w:r>
+              <w:rPr>
+                <w:rFonts w:ascii="Tahoma" w:hAnsi="Tahoma" w:cs="Tahoma"/>
+                <w:bCs/>
+                <w:sz w:val="20"/>
+                <w:szCs w:val="20"/>
+              </w:rPr>
+              <w:t>252€</w:t>
+            </w:r>
+          </w:p>
+        </w:tc>
+      </w:tr>
+      <w:tr>
+        <w:tc>
+          <w:tcPr>
+            <w:tcW w:w="5228" w:type="dxa"/>
+          </w:tcPr>
+          <w:p>
+            <w:pPr>
+              <w:spacing w:after="0" w:afterAutospacing="0"/>
+              <w:jc w:val="both"/>
+              <w:rPr>
+                <w:rFonts w:ascii="Tahoma" w:hAnsi="Tahoma" w:cs="Tahoma"/>
+                <w:bCs/>
+                <w:sz w:val="20"/>
+                <w:szCs w:val="20"/>
+              </w:rPr>
+            </w:pPr>
+            <w:r>
+              <w:rPr>
+                <w:rFonts w:ascii="Tahoma" w:hAnsi="Tahoma" w:cs="Tahoma"/>
+                <w:bCs/>
+                <w:sz w:val="20"/>
+                <w:szCs w:val="20"/>
+              </w:rPr>
+              <w:t>3.3.1: Registro de métricas</w:t>
+            </w:r>
+          </w:p>
+        </w:tc>
+        <w:tc>
+          <w:tcPr>
+            <w:tcW w:w="5228" w:type="dxa"/>
+          </w:tcPr>
+          <w:p>
+            <w:pPr>
+              <w:spacing w:after="0" w:afterAutospacing="0"/>
+              <w:jc w:val="both"/>
+              <w:rPr>
+                <w:rFonts w:ascii="Tahoma" w:hAnsi="Tahoma" w:cs="Tahoma"/>
+                <w:bCs/>
+                <w:sz w:val="20"/>
+                <w:szCs w:val="20"/>
+              </w:rPr>
+            </w:pPr>
+            <w:r>
+              <w:rPr>
+                <w:rFonts w:ascii="Tahoma" w:hAnsi="Tahoma" w:cs="Tahoma"/>
+                <w:bCs/>
+                <w:sz w:val="20"/>
+                <w:szCs w:val="20"/>
+              </w:rPr>
+              <w:t>252€</w:t>
+            </w:r>
+          </w:p>
+        </w:tc>
+      </w:tr>
+      <w:tr>
+        <w:tc>
+          <w:tcPr>
+            <w:tcW w:w="5228" w:type="dxa"/>
+          </w:tcPr>
+          <w:p>
+            <w:pPr>
+              <w:spacing w:after="0" w:afterAutospacing="0"/>
+              <w:jc w:val="both"/>
+              <w:rPr>
+                <w:rFonts w:ascii="Tahoma" w:hAnsi="Tahoma" w:cs="Tahoma"/>
+                <w:bCs/>
+                <w:sz w:val="20"/>
+                <w:szCs w:val="20"/>
+              </w:rPr>
+            </w:pPr>
+            <w:r>
+              <w:rPr>
+                <w:rFonts w:ascii="Tahoma" w:hAnsi="Tahoma" w:cs="Tahoma"/>
+                <w:bCs/>
+                <w:sz w:val="20"/>
+                <w:szCs w:val="20"/>
+              </w:rPr>
+              <w:t>3.3.2: Identificación de jugadores</w:t>
+            </w:r>
+          </w:p>
+        </w:tc>
+        <w:tc>
+          <w:tcPr>
+            <w:tcW w:w="5228" w:type="dxa"/>
+          </w:tcPr>
+          <w:p>
+            <w:pPr>
+              <w:spacing w:after="0" w:afterAutospacing="0"/>
+              <w:jc w:val="both"/>
+              <w:rPr>
+                <w:rFonts w:ascii="Tahoma" w:hAnsi="Tahoma" w:cs="Tahoma"/>
+                <w:bCs/>
+                <w:sz w:val="20"/>
+                <w:szCs w:val="20"/>
+              </w:rPr>
+            </w:pPr>
+            <w:r>
+              <w:rPr>
+                <w:rFonts w:ascii="Tahoma" w:hAnsi="Tahoma" w:cs="Tahoma"/>
+                <w:bCs/>
+                <w:sz w:val="20"/>
+                <w:szCs w:val="20"/>
+              </w:rPr>
+              <w:t>147€</w:t>
+            </w:r>
+          </w:p>
+        </w:tc>
+      </w:tr>
+      <w:tr>
+        <w:tc>
+          <w:tcPr>
+            <w:tcW w:w="5228" w:type="dxa"/>
+          </w:tcPr>
+          <w:p>
+            <w:pPr>
+              <w:spacing w:after="0" w:afterAutospacing="0"/>
+              <w:jc w:val="both"/>
+              <w:rPr>
+                <w:rFonts w:ascii="Tahoma" w:hAnsi="Tahoma" w:cs="Tahoma"/>
+                <w:bCs/>
+                <w:sz w:val="20"/>
+                <w:szCs w:val="20"/>
+              </w:rPr>
+            </w:pPr>
+            <w:r>
+              <w:rPr>
+                <w:rFonts w:ascii="Tahoma" w:hAnsi="Tahoma" w:cs="Tahoma"/>
+                <w:bCs/>
+                <w:sz w:val="20"/>
+                <w:szCs w:val="20"/>
+              </w:rPr>
+              <w:t>3.3.3: Envío y almacenamiento de datos</w:t>
+            </w:r>
+          </w:p>
+        </w:tc>
+        <w:tc>
+          <w:tcPr>
+            <w:tcW w:w="5228" w:type="dxa"/>
+          </w:tcPr>
+          <w:p>
+            <w:pPr>
+              <w:spacing w:after="0" w:afterAutospacing="0"/>
+              <w:jc w:val="both"/>
+              <w:rPr>
+                <w:rFonts w:ascii="Tahoma" w:hAnsi="Tahoma" w:cs="Tahoma"/>
+                <w:bCs/>
+                <w:sz w:val="20"/>
+                <w:szCs w:val="20"/>
+              </w:rPr>
+            </w:pPr>
+            <w:r>
+              <w:rPr>
+                <w:rFonts w:ascii="Tahoma" w:hAnsi="Tahoma" w:cs="Tahoma"/>
+                <w:bCs/>
+                <w:sz w:val="20"/>
+                <w:szCs w:val="20"/>
+              </w:rPr>
+              <w:t>315</w:t>
+            </w:r>
+            <w:r>
+              <w:rPr>
+                <w:rFonts w:ascii="Tahoma" w:hAnsi="Tahoma" w:cs="Tahoma"/>
+                <w:bCs/>
+                <w:sz w:val="20"/>
+                <w:szCs w:val="20"/>
+              </w:rPr>
+              <w:t>€</w:t>
+            </w:r>
+          </w:p>
+        </w:tc>
+      </w:tr>
+      <w:tr>
+        <w:tc>
+          <w:tcPr>
+            <w:tcW w:w="5228" w:type="dxa"/>
+          </w:tcPr>
+          <w:p>
+            <w:pPr>
+              <w:spacing w:after="0" w:afterAutospacing="0"/>
+              <w:jc w:val="both"/>
+              <w:rPr>
+                <w:rFonts w:ascii="Tahoma" w:hAnsi="Tahoma" w:cs="Tahoma"/>
+                <w:bCs/>
+                <w:sz w:val="20"/>
+                <w:szCs w:val="20"/>
+              </w:rPr>
+            </w:pPr>
+            <w:r>
+              <w:rPr>
+                <w:rFonts w:ascii="Tahoma" w:hAnsi="Tahoma" w:cs="Tahoma"/>
+                <w:bCs/>
+                <w:sz w:val="20"/>
+                <w:szCs w:val="20"/>
+              </w:rPr>
+              <w:t>3.3.4: Visualización del</w:t>
+            </w:r>
+            <w:r>
+              <w:rPr>
+                <w:rFonts w:ascii="Tahoma" w:hAnsi="Tahoma" w:cs="Tahoma"/>
+                <w:bCs/>
+                <w:sz w:val="20"/>
+                <w:szCs w:val="20"/>
+              </w:rPr>
+              <w:t xml:space="preserve"> leaderboard</w:t>
+            </w:r>
+          </w:p>
+        </w:tc>
+        <w:tc>
+          <w:tcPr>
+            <w:tcW w:w="5228" w:type="dxa"/>
+          </w:tcPr>
+          <w:p>
+            <w:pPr>
+              <w:spacing w:after="0" w:afterAutospacing="0"/>
+              <w:jc w:val="both"/>
+              <w:rPr>
+                <w:rFonts w:ascii="Tahoma" w:hAnsi="Tahoma" w:cs="Tahoma"/>
+                <w:bCs/>
+                <w:sz w:val="20"/>
+                <w:szCs w:val="20"/>
+              </w:rPr>
+            </w:pPr>
+            <w:r>
+              <w:rPr>
+                <w:rFonts w:ascii="Tahoma" w:hAnsi="Tahoma" w:cs="Tahoma"/>
+                <w:bCs/>
+                <w:sz w:val="20"/>
+                <w:szCs w:val="20"/>
+              </w:rPr>
+              <w:t>268€</w:t>
+            </w:r>
+          </w:p>
+        </w:tc>
+      </w:tr>
+      <w:tr>
+        <w:tc>
+          <w:tcPr>
+            <w:tcW w:w="5228" w:type="dxa"/>
+          </w:tcPr>
+          <w:p>
+            <w:pPr>
+              <w:spacing w:after="0" w:afterAutospacing="0"/>
+              <w:jc w:val="both"/>
+              <w:rPr>
+                <w:rFonts w:ascii="Tahoma" w:hAnsi="Tahoma" w:cs="Tahoma"/>
+                <w:bCs/>
+                <w:sz w:val="20"/>
+                <w:szCs w:val="20"/>
+              </w:rPr>
+            </w:pPr>
+            <w:r>
+              <w:rPr>
+                <w:rFonts w:ascii="Tahoma" w:hAnsi="Tahoma" w:cs="Tahoma"/>
+                <w:bCs/>
+                <w:sz w:val="20"/>
+                <w:szCs w:val="20"/>
+              </w:rPr>
+              <w:t>3.4.1: Música de niveles</w:t>
+            </w:r>
+          </w:p>
+        </w:tc>
+        <w:tc>
+          <w:tcPr>
+            <w:tcW w:w="5228" w:type="dxa"/>
+          </w:tcPr>
+          <w:p>
+            <w:pPr>
+              <w:spacing w:after="0" w:afterAutospacing="0"/>
+              <w:jc w:val="both"/>
+              <w:rPr>
+                <w:rFonts w:ascii="Tahoma" w:hAnsi="Tahoma" w:cs="Tahoma"/>
+                <w:bCs/>
+                <w:sz w:val="20"/>
+                <w:szCs w:val="20"/>
+              </w:rPr>
+            </w:pPr>
+            <w:r>
+              <w:rPr>
+                <w:rFonts w:ascii="Tahoma" w:hAnsi="Tahoma" w:cs="Tahoma"/>
+                <w:bCs/>
+                <w:sz w:val="20"/>
+                <w:szCs w:val="20"/>
+              </w:rPr>
+              <w:t>420€</w:t>
+            </w:r>
+          </w:p>
+        </w:tc>
+      </w:tr>
+      <w:tr>
+        <w:tc>
+          <w:tcPr>
+            <w:tcW w:w="5228" w:type="dxa"/>
+          </w:tcPr>
+          <w:p>
+            <w:pPr>
+              <w:spacing w:after="0" w:afterAutospacing="0"/>
+              <w:jc w:val="both"/>
+              <w:rPr>
+                <w:rFonts w:ascii="Tahoma" w:hAnsi="Tahoma" w:cs="Tahoma"/>
+                <w:bCs/>
+                <w:sz w:val="20"/>
+                <w:szCs w:val="20"/>
+              </w:rPr>
+            </w:pPr>
+            <w:r>
+              <w:rPr>
+                <w:rFonts w:ascii="Tahoma" w:hAnsi="Tahoma" w:cs="Tahoma"/>
+                <w:bCs/>
+                <w:sz w:val="20"/>
+                <w:szCs w:val="20"/>
+              </w:rPr>
+              <w:t>3.4.2: Música de jefes</w:t>
+            </w:r>
+          </w:p>
+        </w:tc>
+        <w:tc>
+          <w:tcPr>
+            <w:tcW w:w="5228" w:type="dxa"/>
+          </w:tcPr>
+          <w:p>
+            <w:pPr>
+              <w:spacing w:after="0" w:afterAutospacing="0"/>
+              <w:jc w:val="both"/>
+              <w:rPr>
+                <w:rFonts w:ascii="Tahoma" w:hAnsi="Tahoma" w:cs="Tahoma"/>
+                <w:bCs/>
+                <w:sz w:val="20"/>
+                <w:szCs w:val="20"/>
+              </w:rPr>
+            </w:pPr>
+            <w:r>
+              <w:rPr>
+                <w:rFonts w:ascii="Tahoma" w:hAnsi="Tahoma" w:cs="Tahoma"/>
+                <w:bCs/>
+                <w:sz w:val="20"/>
+                <w:szCs w:val="20"/>
+              </w:rPr>
+              <w:t>525€</w:t>
+            </w:r>
+          </w:p>
+        </w:tc>
+      </w:tr>
+      <w:tr>
+        <w:tc>
+          <w:tcPr>
+            <w:tcW w:w="5228" w:type="dxa"/>
+          </w:tcPr>
+          <w:p>
+            <w:pPr>
+              <w:spacing w:after="0" w:afterAutospacing="0"/>
+              <w:jc w:val="both"/>
+              <w:rPr>
+                <w:rFonts w:ascii="Tahoma" w:hAnsi="Tahoma" w:cs="Tahoma"/>
+                <w:bCs/>
+                <w:sz w:val="20"/>
+                <w:szCs w:val="20"/>
+              </w:rPr>
+            </w:pPr>
+            <w:r>
+              <w:rPr>
+                <w:rFonts w:ascii="Tahoma" w:hAnsi="Tahoma" w:cs="Tahoma"/>
+                <w:bCs/>
+                <w:sz w:val="20"/>
+                <w:szCs w:val="20"/>
+              </w:rPr>
+              <w:t>3.4.3: Música de pantallas secundarias</w:t>
+            </w:r>
+          </w:p>
+        </w:tc>
+        <w:tc>
+          <w:tcPr>
+            <w:tcW w:w="5228" w:type="dxa"/>
+          </w:tcPr>
+          <w:p>
+            <w:pPr>
+              <w:spacing w:after="0" w:afterAutospacing="0"/>
+              <w:jc w:val="both"/>
+              <w:rPr>
+                <w:rFonts w:ascii="Tahoma" w:hAnsi="Tahoma" w:cs="Tahoma"/>
+                <w:bCs/>
+                <w:sz w:val="20"/>
+                <w:szCs w:val="20"/>
+              </w:rPr>
+            </w:pPr>
+            <w:r>
+              <w:rPr>
+                <w:rFonts w:ascii="Tahoma" w:hAnsi="Tahoma" w:cs="Tahoma"/>
+                <w:bCs/>
+                <w:sz w:val="20"/>
+                <w:szCs w:val="20"/>
+              </w:rPr>
+              <w:t>252€</w:t>
+            </w:r>
+          </w:p>
+        </w:tc>
+      </w:tr>
+      <w:tr>
+        <w:tc>
+          <w:tcPr>
+            <w:tcW w:w="5228" w:type="dxa"/>
+          </w:tcPr>
+          <w:p>
+            <w:pPr>
+              <w:spacing w:after="0" w:afterAutospacing="0"/>
+              <w:jc w:val="both"/>
+              <w:rPr>
+                <w:rFonts w:ascii="Tahoma" w:hAnsi="Tahoma" w:cs="Tahoma"/>
+                <w:bCs/>
+                <w:sz w:val="20"/>
+                <w:szCs w:val="20"/>
+              </w:rPr>
+            </w:pPr>
+            <w:r>
+              <w:rPr>
+                <w:rFonts w:ascii="Tahoma" w:hAnsi="Tahoma" w:cs="Tahoma"/>
+                <w:bCs/>
+                <w:sz w:val="20"/>
+                <w:szCs w:val="20"/>
+              </w:rPr>
+              <w:t>3.4.4: Efectos de sonido</w:t>
+            </w:r>
+          </w:p>
+        </w:tc>
+        <w:tc>
+          <w:tcPr>
+            <w:tcW w:w="5228" w:type="dxa"/>
+          </w:tcPr>
+          <w:p>
+            <w:pPr>
+              <w:spacing w:after="0" w:afterAutospacing="0"/>
+              <w:jc w:val="both"/>
+              <w:rPr>
+                <w:rFonts w:ascii="Tahoma" w:hAnsi="Tahoma" w:cs="Tahoma"/>
+                <w:bCs/>
+                <w:sz w:val="20"/>
+                <w:szCs w:val="20"/>
+              </w:rPr>
+            </w:pPr>
+            <w:r>
+              <w:rPr>
+                <w:rFonts w:ascii="Tahoma" w:hAnsi="Tahoma" w:cs="Tahoma"/>
+                <w:bCs/>
+                <w:sz w:val="20"/>
+                <w:szCs w:val="20"/>
+              </w:rPr>
+              <w:t>336€</w:t>
+            </w:r>
+          </w:p>
+        </w:tc>
+      </w:tr>
+      <w:tr>
+        <w:tc>
+          <w:tcPr>
+            <w:tcW w:w="5228" w:type="dxa"/>
+          </w:tcPr>
+          <w:p>
+            <w:pPr>
+              <w:spacing w:after="0" w:afterAutospacing="0"/>
+              <w:jc w:val="both"/>
+              <w:rPr>
+                <w:rFonts w:ascii="Tahoma" w:hAnsi="Tahoma" w:cs="Tahoma"/>
+                <w:bCs/>
+                <w:sz w:val="20"/>
+                <w:szCs w:val="20"/>
+              </w:rPr>
+            </w:pPr>
+            <w:r>
+              <w:rPr>
+                <w:rFonts w:ascii="Tahoma" w:hAnsi="Tahoma" w:cs="Tahoma"/>
+                <w:bCs/>
+                <w:sz w:val="20"/>
+                <w:szCs w:val="20"/>
+              </w:rPr>
+              <w:t>3.4.5: Sistema de control de volumen</w:t>
+            </w:r>
+          </w:p>
+        </w:tc>
+        <w:tc>
+          <w:tcPr>
+            <w:tcW w:w="5228" w:type="dxa"/>
+          </w:tcPr>
+          <w:p>
+            <w:pPr>
+              <w:spacing w:after="0" w:afterAutospacing="0"/>
+              <w:jc w:val="both"/>
+              <w:rPr>
+                <w:rFonts w:ascii="Tahoma" w:hAnsi="Tahoma" w:cs="Tahoma"/>
+                <w:bCs/>
+                <w:sz w:val="20"/>
+                <w:szCs w:val="20"/>
+              </w:rPr>
+            </w:pPr>
+            <w:r>
+              <w:rPr>
+                <w:rFonts w:ascii="Tahoma" w:hAnsi="Tahoma" w:cs="Tahoma"/>
+                <w:bCs/>
+                <w:sz w:val="20"/>
+                <w:szCs w:val="20"/>
+              </w:rPr>
+              <w:t>252€</w:t>
+            </w:r>
+          </w:p>
+        </w:tc>
+      </w:tr>
+      <w:tr>
+        <w:tc>
+          <w:tcPr>
+            <w:tcW w:w="5228" w:type="dxa"/>
+          </w:tcPr>
+          <w:p>
+            <w:pPr>
+              <w:spacing w:after="0" w:afterAutospacing="0"/>
+              <w:jc w:val="both"/>
+              <w:rPr>
+                <w:rFonts w:ascii="Tahoma" w:hAnsi="Tahoma" w:cs="Tahoma"/>
+                <w:bCs/>
+                <w:sz w:val="20"/>
+                <w:szCs w:val="20"/>
+              </w:rPr>
+            </w:pPr>
+            <w:r>
+              <w:rPr>
+                <w:rFonts w:ascii="Tahoma" w:hAnsi="Tahoma" w:cs="Tahoma"/>
+                <w:bCs/>
+                <w:sz w:val="20"/>
+                <w:szCs w:val="20"/>
+              </w:rPr>
+              <w:t xml:space="preserve">4.1.1: </w:t>
+            </w:r>
+            <w:r>
+              <w:rPr>
+                <w:rFonts w:ascii="Tahoma" w:hAnsi="Tahoma" w:cs="Tahoma"/>
+                <w:bCs/>
+                <w:sz w:val="20"/>
+                <w:szCs w:val="20"/>
+              </w:rPr>
+              <w:t>Plan de pruebas</w:t>
+            </w:r>
+          </w:p>
+        </w:tc>
+        <w:tc>
+          <w:tcPr>
+            <w:tcW w:w="5228" w:type="dxa"/>
+          </w:tcPr>
+          <w:p>
+            <w:pPr>
+              <w:spacing w:after="0" w:afterAutospacing="0"/>
+              <w:jc w:val="both"/>
+              <w:rPr>
+                <w:rFonts w:ascii="Tahoma" w:hAnsi="Tahoma" w:cs="Tahoma"/>
+                <w:bCs/>
+                <w:sz w:val="20"/>
+                <w:szCs w:val="20"/>
+              </w:rPr>
+            </w:pPr>
+            <w:r>
+              <w:rPr>
+                <w:rFonts w:ascii="Tahoma" w:hAnsi="Tahoma" w:cs="Tahoma"/>
+                <w:bCs/>
+                <w:sz w:val="20"/>
+                <w:szCs w:val="20"/>
+              </w:rPr>
+              <w:t>165€</w:t>
+            </w:r>
+          </w:p>
+        </w:tc>
+      </w:tr>
+      <w:tr>
+        <w:tc>
+          <w:tcPr>
+            <w:tcW w:w="5228" w:type="dxa"/>
+          </w:tcPr>
+          <w:p>
+            <w:pPr>
+              <w:spacing w:after="0" w:afterAutospacing="0"/>
+              <w:jc w:val="both"/>
+              <w:rPr>
+                <w:rFonts w:ascii="Tahoma" w:hAnsi="Tahoma" w:cs="Tahoma"/>
+                <w:bCs/>
+                <w:sz w:val="20"/>
+                <w:szCs w:val="20"/>
+              </w:rPr>
+            </w:pPr>
+            <w:r>
+              <w:rPr>
+                <w:rFonts w:ascii="Tahoma" w:hAnsi="Tahoma" w:cs="Tahoma"/>
+                <w:bCs/>
+                <w:sz w:val="20"/>
+                <w:szCs w:val="20"/>
+              </w:rPr>
+              <w:t>4.1.2: Pruebas funcionales</w:t>
+            </w:r>
+          </w:p>
+        </w:tc>
+        <w:tc>
+          <w:tcPr>
+            <w:tcW w:w="5228" w:type="dxa"/>
+          </w:tcPr>
+          <w:p>
+            <w:pPr>
+              <w:spacing w:after="0" w:afterAutospacing="0"/>
+              <w:jc w:val="both"/>
+              <w:rPr>
+                <w:rFonts w:ascii="Tahoma" w:hAnsi="Tahoma" w:cs="Tahoma"/>
+                <w:bCs/>
+                <w:sz w:val="20"/>
+                <w:szCs w:val="20"/>
+              </w:rPr>
+            </w:pPr>
+            <w:r>
+              <w:rPr>
+                <w:rFonts w:ascii="Tahoma" w:hAnsi="Tahoma" w:cs="Tahoma"/>
+                <w:bCs/>
+                <w:sz w:val="20"/>
+                <w:szCs w:val="20"/>
+              </w:rPr>
+              <w:t>405€</w:t>
+            </w:r>
+          </w:p>
+        </w:tc>
+      </w:tr>
+      <w:tr>
+        <w:tc>
+          <w:tcPr>
+            <w:tcW w:w="5228" w:type="dxa"/>
+          </w:tcPr>
+          <w:p>
+            <w:pPr>
+              <w:spacing w:after="0" w:afterAutospacing="0"/>
+              <w:jc w:val="both"/>
+              <w:rPr>
+                <w:rFonts w:ascii="Tahoma" w:hAnsi="Tahoma" w:cs="Tahoma"/>
+                <w:bCs/>
+                <w:sz w:val="20"/>
+                <w:szCs w:val="20"/>
+              </w:rPr>
+            </w:pPr>
+            <w:r>
+              <w:rPr>
+                <w:rFonts w:ascii="Tahoma" w:hAnsi="Tahoma" w:cs="Tahoma"/>
+                <w:bCs/>
+                <w:sz w:val="20"/>
+                <w:szCs w:val="20"/>
+              </w:rPr>
+              <w:t xml:space="preserve">4.1.3: </w:t>
+            </w:r>
+            <w:r>
+              <w:rPr>
+                <w:rFonts w:ascii="Tahoma" w:hAnsi="Tahoma" w:cs="Tahoma"/>
+                <w:bCs/>
+                <w:sz w:val="20"/>
+                <w:szCs w:val="20"/>
+              </w:rPr>
+              <w:t>Pruebas de jugabilidad</w:t>
+            </w:r>
+          </w:p>
+        </w:tc>
+        <w:tc>
+          <w:tcPr>
+            <w:tcW w:w="5228" w:type="dxa"/>
+          </w:tcPr>
+          <w:p>
+            <w:pPr>
+              <w:spacing w:after="0" w:afterAutospacing="0"/>
+              <w:jc w:val="both"/>
+              <w:rPr>
+                <w:rFonts w:ascii="Tahoma" w:hAnsi="Tahoma" w:cs="Tahoma"/>
+                <w:bCs/>
+                <w:sz w:val="20"/>
+                <w:szCs w:val="20"/>
+              </w:rPr>
+            </w:pPr>
+            <w:r>
+              <w:rPr>
+                <w:rFonts w:ascii="Tahoma" w:hAnsi="Tahoma" w:cs="Tahoma"/>
+                <w:bCs/>
+                <w:sz w:val="20"/>
+                <w:szCs w:val="20"/>
+              </w:rPr>
+              <w:t>420</w:t>
+            </w:r>
+            <w:r>
+              <w:rPr>
+                <w:rFonts w:ascii="Tahoma" w:hAnsi="Tahoma" w:cs="Tahoma"/>
+                <w:bCs/>
+                <w:sz w:val="20"/>
+                <w:szCs w:val="20"/>
+              </w:rPr>
+              <w:t>€</w:t>
+            </w:r>
+          </w:p>
+        </w:tc>
+      </w:tr>
+      <w:tr>
+        <w:tc>
+          <w:tcPr>
+            <w:tcW w:w="5228" w:type="dxa"/>
+          </w:tcPr>
+          <w:p>
+            <w:pPr>
+              <w:spacing w:after="0" w:afterAutospacing="0"/>
+              <w:jc w:val="both"/>
+              <w:rPr>
+                <w:rFonts w:ascii="Tahoma" w:hAnsi="Tahoma" w:cs="Tahoma"/>
+                <w:bCs/>
+                <w:sz w:val="20"/>
+                <w:szCs w:val="20"/>
+              </w:rPr>
+            </w:pPr>
+            <w:r>
+              <w:rPr>
+                <w:rFonts w:ascii="Tahoma" w:hAnsi="Tahoma" w:cs="Tahoma"/>
+                <w:bCs/>
+                <w:sz w:val="20"/>
+                <w:szCs w:val="20"/>
+              </w:rPr>
+              <w:t>4.1.4: Optimización</w:t>
+            </w:r>
+          </w:p>
+        </w:tc>
+        <w:tc>
+          <w:tcPr>
+            <w:tcW w:w="5228" w:type="dxa"/>
+          </w:tcPr>
+          <w:p>
+            <w:pPr>
+              <w:spacing w:after="0" w:afterAutospacing="0"/>
+              <w:jc w:val="both"/>
+              <w:rPr>
+                <w:rFonts w:ascii="Tahoma" w:hAnsi="Tahoma" w:cs="Tahoma"/>
+                <w:bCs/>
+                <w:sz w:val="20"/>
+                <w:szCs w:val="20"/>
+              </w:rPr>
+            </w:pPr>
+            <w:r>
+              <w:rPr>
+                <w:rFonts w:ascii="Tahoma" w:hAnsi="Tahoma" w:cs="Tahoma"/>
+                <w:bCs/>
+                <w:sz w:val="20"/>
+                <w:szCs w:val="20"/>
+              </w:rPr>
+              <w:t>300€</w:t>
+            </w:r>
+          </w:p>
+        </w:tc>
+      </w:tr>
+      <w:tr>
+        <w:tc>
+          <w:tcPr>
+            <w:tcW w:w="5228" w:type="dxa"/>
+          </w:tcPr>
+          <w:p>
+            <w:pPr>
+              <w:spacing w:after="0" w:afterAutospacing="0"/>
+              <w:jc w:val="both"/>
+              <w:rPr>
+                <w:rFonts w:ascii="Tahoma" w:hAnsi="Tahoma" w:cs="Tahoma"/>
+                <w:bCs/>
+                <w:sz w:val="20"/>
+                <w:szCs w:val="20"/>
+              </w:rPr>
+            </w:pPr>
+            <w:r>
+              <w:rPr>
+                <w:rFonts w:ascii="Tahoma" w:hAnsi="Tahoma" w:cs="Tahoma"/>
+                <w:bCs/>
+                <w:sz w:val="20"/>
+                <w:szCs w:val="20"/>
+              </w:rPr>
+              <w:t>5.1.1: Build jugable</w:t>
+            </w:r>
+          </w:p>
+        </w:tc>
+        <w:tc>
+          <w:tcPr>
+            <w:tcW w:w="5228" w:type="dxa"/>
+          </w:tcPr>
+          <w:p>
+            <w:pPr>
+              <w:spacing w:after="0" w:afterAutospacing="0"/>
+              <w:jc w:val="both"/>
+              <w:rPr>
+                <w:rFonts w:ascii="Tahoma" w:hAnsi="Tahoma" w:cs="Tahoma"/>
+                <w:bCs/>
+                <w:sz w:val="20"/>
+                <w:szCs w:val="20"/>
+              </w:rPr>
+            </w:pPr>
+            <w:r>
+              <w:rPr>
+                <w:rFonts w:ascii="Tahoma" w:hAnsi="Tahoma" w:cs="Tahoma"/>
+                <w:bCs/>
+                <w:sz w:val="20"/>
+                <w:szCs w:val="20"/>
+              </w:rPr>
+              <w:t>357€</w:t>
+            </w:r>
+          </w:p>
+        </w:tc>
+      </w:tr>
+      <w:tr>
+        <w:tc>
+          <w:tcPr>
+            <w:tcW w:w="5228" w:type="dxa"/>
+          </w:tcPr>
+          <w:p>
+            <w:pPr>
+              <w:spacing w:after="0" w:afterAutospacing="0"/>
+              <w:jc w:val="both"/>
+              <w:rPr>
+                <w:rFonts w:ascii="Tahoma" w:hAnsi="Tahoma" w:cs="Tahoma"/>
+                <w:bCs/>
+                <w:sz w:val="20"/>
+                <w:szCs w:val="20"/>
+              </w:rPr>
+            </w:pPr>
+            <w:r>
+              <w:rPr>
+                <w:rFonts w:ascii="Tahoma" w:hAnsi="Tahoma" w:cs="Tahoma"/>
+                <w:bCs/>
+                <w:sz w:val="20"/>
+                <w:szCs w:val="20"/>
+              </w:rPr>
+              <w:t xml:space="preserve">5.2.1: </w:t>
+            </w:r>
+            <w:r>
+              <w:rPr>
+                <w:rFonts w:ascii="Tahoma" w:hAnsi="Tahoma" w:cs="Tahoma"/>
+                <w:bCs/>
+                <w:sz w:val="20"/>
+                <w:szCs w:val="20"/>
+              </w:rPr>
+              <w:t>Memoria</w:t>
+            </w:r>
+          </w:p>
+        </w:tc>
+        <w:tc>
+          <w:tcPr>
+            <w:tcW w:w="5228" w:type="dxa"/>
+          </w:tcPr>
+          <w:p>
+            <w:pPr>
+              <w:spacing w:after="0" w:afterAutospacing="0"/>
+              <w:jc w:val="both"/>
+              <w:rPr>
+                <w:rFonts w:ascii="Tahoma" w:hAnsi="Tahoma" w:cs="Tahoma"/>
+                <w:bCs/>
+                <w:sz w:val="20"/>
+                <w:szCs w:val="20"/>
+              </w:rPr>
+            </w:pPr>
+            <w:r>
+              <w:rPr>
+                <w:rFonts w:ascii="Tahoma" w:hAnsi="Tahoma" w:cs="Tahoma"/>
+                <w:bCs/>
+                <w:sz w:val="20"/>
+                <w:szCs w:val="20"/>
+              </w:rPr>
+              <w:t>2220€</w:t>
+            </w:r>
+          </w:p>
+        </w:tc>
+      </w:tr>
+      <w:tr>
+        <w:tc>
+          <w:tcPr>
+            <w:tcW w:w="5228" w:type="dxa"/>
+          </w:tcPr>
+          <w:p>
+            <w:pPr>
+              <w:spacing w:after="0" w:afterAutospacing="0"/>
+              <w:jc w:val="both"/>
+              <w:rPr>
+                <w:rFonts w:ascii="Tahoma" w:hAnsi="Tahoma" w:cs="Tahoma"/>
+                <w:bCs/>
+                <w:sz w:val="20"/>
+                <w:szCs w:val="20"/>
+              </w:rPr>
+            </w:pPr>
+            <w:r>
+              <w:rPr>
+                <w:rFonts w:ascii="Tahoma" w:hAnsi="Tahoma" w:cs="Tahoma"/>
+                <w:bCs/>
+                <w:sz w:val="20"/>
+                <w:szCs w:val="20"/>
+              </w:rPr>
+              <w:t xml:space="preserve">5.2.2: </w:t>
+            </w:r>
+            <w:r>
+              <w:rPr>
+                <w:rFonts w:ascii="Tahoma" w:hAnsi="Tahoma" w:cs="Tahoma"/>
+                <w:bCs/>
+                <w:sz w:val="20"/>
+                <w:szCs w:val="20"/>
+              </w:rPr>
+              <w:t>Manuales</w:t>
+            </w:r>
+          </w:p>
+        </w:tc>
+        <w:tc>
+          <w:tcPr>
+            <w:tcW w:w="5228" w:type="dxa"/>
+          </w:tcPr>
+          <w:p>
+            <w:pPr>
+              <w:spacing w:after="0" w:afterAutospacing="0"/>
+              <w:jc w:val="both"/>
+              <w:rPr>
+                <w:rFonts w:ascii="Tahoma" w:hAnsi="Tahoma" w:cs="Tahoma"/>
+                <w:bCs/>
+                <w:sz w:val="20"/>
+                <w:szCs w:val="20"/>
+              </w:rPr>
+            </w:pPr>
+            <w:r>
+              <w:rPr>
+                <w:rFonts w:ascii="Tahoma" w:hAnsi="Tahoma" w:cs="Tahoma"/>
+                <w:bCs/>
+                <w:sz w:val="20"/>
+                <w:szCs w:val="20"/>
+              </w:rPr>
+              <w:t>315€</w:t>
+            </w:r>
+          </w:p>
+        </w:tc>
+      </w:tr>
+      <w:tr>
+        <w:tc>
+          <w:tcPr>
+            <w:tcW w:w="5228" w:type="dxa"/>
+            <w:shd w:val="clear" w:color="auto" w:fill="D9D9D9" w:themeFill="background1" w:themeFillShade="D9"/>
+          </w:tcPr>
+          <w:p>
+            <w:pPr>
+              <w:spacing w:after="0" w:afterAutospacing="0"/>
+              <w:jc w:val="both"/>
+              <w:rPr>
+                <w:rFonts w:ascii="Tahoma" w:hAnsi="Tahoma" w:cs="Tahoma"/>
+                <w:b/>
+                <w:sz w:val="20"/>
+                <w:szCs w:val="20"/>
+              </w:rPr>
+            </w:pPr>
+            <w:r>
+              <w:rPr>
+                <w:rFonts w:ascii="Tahoma" w:hAnsi="Tahoma" w:cs="Tahoma"/>
+                <w:b/>
+                <w:sz w:val="20"/>
+                <w:szCs w:val="20"/>
+              </w:rPr>
+              <w:t>TOTAL</w:t>
+            </w:r>
+          </w:p>
+        </w:tc>
+        <w:tc>
+          <w:tcPr>
+            <w:tcW w:w="5228" w:type="dxa"/>
+          </w:tcPr>
+          <w:p>
+            <w:pPr>
+              <w:spacing w:after="0" w:afterAutospacing="0"/>
+              <w:jc w:val="both"/>
+              <w:rPr>
+                <w:rFonts w:ascii="Tahoma" w:hAnsi="Tahoma" w:cs="Tahoma"/>
+                <w:bCs/>
+                <w:sz w:val="20"/>
+                <w:szCs w:val="20"/>
+              </w:rPr>
+            </w:pPr>
+            <w:r>
+              <w:rPr>
+                <w:rFonts w:ascii="Tahoma" w:hAnsi="Tahoma" w:cs="Tahoma"/>
+                <w:bCs/>
+                <w:sz w:val="20"/>
+                <w:szCs w:val="20"/>
+              </w:rPr>
+              <w:t>23.393€</w:t>
+            </w:r>
           </w:p>
         </w:tc>
       </w:tr>
     </w:tbl>
+    <w:p>
+      <w:pPr>
+        <w:shd w:val="clear" w:color="auto" w:fill="FFFFFF" w:themeFill="background1"/>
+        <w:spacing w:after="0" w:afterAutospacing="0"/>
+        <w:jc w:val="both"/>
+        <w:rPr>
+          <w:rFonts w:ascii="Tahoma" w:hAnsi="Tahoma" w:cs="Tahoma"/>
+          <w:b/>
+          <w:sz w:val="20"/>
+          <w:szCs w:val="20"/>
+        </w:rPr>
+      </w:pPr>
+    </w:p>
     <w:p>
       <w:pPr>
         <w:shd w:val="clear" w:color="auto" w:fill="FFFFFF" w:themeFill="background1"/>
@@ -1604,7 +5169,7 @@
     </w:p>
     <w:tbl>
       <w:tblPr>
-        <w:tblStyle w:val="Tablaconcuadrcula"/>
+        <w:tblStyle w:val="TableGrid"/>
         <w:tblW w:w="0" w:type="auto"/>
         <w:tblLook w:val="04A0" w:firstRow="1" w:lastRow="0" w:firstColumn="1" w:lastColumn="0" w:noHBand="0" w:noVBand="1"/>
       </w:tblPr>
@@ -1755,7 +5320,7 @@
     </w:p>
     <w:tbl>
       <w:tblPr>
-        <w:tblStyle w:val="Tablaconcuadrcula"/>
+        <w:tblStyle w:val="TableGrid"/>
         <w:tblW w:w="0" w:type="auto"/>
         <w:tblLook w:val="04A0" w:firstRow="1" w:lastRow="0" w:firstColumn="1" w:lastColumn="0" w:noHBand="0" w:noVBand="1"/>
       </w:tblPr>
@@ -1798,7 +5363,7 @@
           </w:tcPr>
           <w:p>
             <w:pPr>
-              <w:pStyle w:val="Prrafodelista"/>
+              <w:pStyle w:val="ListParagraph"/>
               <w:numPr>
                 <w:ilvl w:val="0"/>
                 <w:numId w:val="5"/>
@@ -1828,7 +5393,7 @@
           </w:p>
           <w:p>
             <w:pPr>
-              <w:pStyle w:val="Prrafodelista"/>
+              <w:pStyle w:val="ListParagraph"/>
               <w:numPr>
                 <w:ilvl w:val="0"/>
                 <w:numId w:val="5"/>
@@ -1858,7 +5423,7 @@
           </w:p>
           <w:p>
             <w:pPr>
-              <w:pStyle w:val="Prrafodelista"/>
+              <w:pStyle w:val="ListParagraph"/>
               <w:spacing w:after="0" w:line="240" w:lineRule="auto"/>
               <w:rPr>
                 <w:rFonts w:ascii="Tahoma" w:hAnsi="Tahoma" w:cs="Tahoma"/>
@@ -1881,7 +5446,7 @@
     </w:p>
     <w:tbl>
       <w:tblPr>
-        <w:tblStyle w:val="Tablaconcuadrcula"/>
+        <w:tblStyle w:val="TableGrid"/>
         <w:tblW w:w="0" w:type="auto"/>
         <w:tblLook w:val="04A0" w:firstRow="1" w:lastRow="0" w:firstColumn="1" w:lastColumn="0" w:noHBand="0" w:noVBand="1"/>
       </w:tblPr>
@@ -1960,7 +5525,7 @@
     </w:p>
     <w:tbl>
       <w:tblPr>
-        <w:tblStyle w:val="Tablaconcuadrcula"/>
+        <w:tblStyle w:val="TableGrid"/>
         <w:tblW w:w="0" w:type="auto"/>
         <w:tblLook w:val="04A0" w:firstRow="1" w:lastRow="0" w:firstColumn="1" w:lastColumn="0" w:noHBand="0" w:noVBand="1"/>
       </w:tblPr>
@@ -2174,7 +5739,7 @@
         </w:tcPr>
         <w:p>
           <w:pPr>
-            <w:pStyle w:val="Piedepgina"/>
+            <w:pStyle w:val="Footer"/>
             <w:jc w:val="right"/>
             <w:rPr>
               <w:lang w:val="es-PR"/>
@@ -2195,7 +5760,7 @@
         </w:tcPr>
         <w:p>
           <w:pPr>
-            <w:pStyle w:val="Piedepgina"/>
+            <w:pStyle w:val="Footer"/>
             <w:rPr>
               <w:lang w:val="es-PR"/>
             </w:rPr>
@@ -2206,7 +5771,7 @@
   </w:tbl>
   <w:p>
     <w:pPr>
-      <w:pStyle w:val="Piedepgina"/>
+      <w:pStyle w:val="Footer"/>
       <w:jc w:val="right"/>
       <w:rPr>
         <w:lang w:val="es-PR"/>
@@ -2311,7 +5876,7 @@
 <w:hdr xmlns:wpc="http://schemas.microsoft.com/office/word/2010/wordprocessingCanvas" xmlns:cx="http://schemas.microsoft.com/office/drawing/2014/chartex" xmlns:cx1="http://schemas.microsoft.com/office/drawing/2015/9/8/chartex" xmlns:cx2="http://schemas.microsoft.com/office/drawing/2015/10/21/chartex" xmlns:cx3="http://schemas.microsoft.com/office/drawing/2016/5/9/chartex" xmlns:cx4="http://schemas.microsoft.com/office/drawing/2016/5/10/chartex" xmlns:cx5="http://schemas.microsoft.com/office/drawing/2016/5/11/chartex" xmlns:cx6="http://schemas.microsoft.com/office/drawing/2016/5/12/chartex" xmlns:cx7="http://schemas.microsoft.com/office/drawing/2016/5/13/chartex" xmlns:cx8="http://schemas.microsoft.com/office/drawing/2016/5/14/chartex" xmlns:mc="http://schemas.openxmlformats.org/markup-compatibility/2006" xmlns:aink="http://schemas.microsoft.com/office/drawing/2016/ink" xmlns:am3d="http://schemas.microsoft.com/office/drawing/2017/model3d" xmlns:o="urn:schemas-microsoft-com:office:office" xmlns:oel="http://schemas.microsoft.com/office/2019/extlst" xmlns:r="http://schemas.openxmlformats.org/officeDocument/2006/relationships" xmlns:m="http://schemas.openxmlformats.org/officeDocument/2006/math" xmlns:v="urn:schemas-microsoft-com:vml" xmlns:wp14="http://schemas.microsoft.com/office/word/2010/wordprocessingDrawing" xmlns:wp="http://schemas.openxmlformats.org/drawingml/2006/wordprocessingDrawing" xmlns:w10="urn:schemas-microsoft-com:office:word" xmlns:w="http://schemas.openxmlformats.org/wordprocessingml/2006/main" xmlns:w14="http://schemas.microsoft.com/office/word/2010/wordml" xmlns:w15="http://schemas.microsoft.com/office/word/2012/wordml" xmlns:w16cex="http://schemas.microsoft.com/office/word/2018/wordml/cex" xmlns:w16cid="http://schemas.microsoft.com/office/word/2016/wordml/cid" xmlns:w16="http://schemas.microsoft.com/office/word/2018/wordml" xmlns:w16du="http://schemas.microsoft.com/office/word/2023/wordml/word16du" xmlns:w16sdtdh="http://schemas.microsoft.com/office/word/2020/wordml/sdtdatahash" xmlns:w16sdtfl="http://schemas.microsoft.com/office/word/2024/wordml/sdtformatlock" xmlns:w16se="http://schemas.microsoft.com/office/word/2015/wordml/symex" xmlns:wpg="http://schemas.microsoft.com/office/word/2010/wordprocessingGroup" xmlns:wpi="http://schemas.microsoft.com/office/word/2010/wordprocessingInk" xmlns:wne="http://schemas.microsoft.com/office/word/2006/wordml" xmlns:wps="http://schemas.microsoft.com/office/word/2010/wordprocessingShape" mc:Ignorable="w14 w15 w16se w16cid w16 w16cex w16sdtdh w16sdtfl w16du wp14">
   <w:p>
     <w:pPr>
-      <w:pStyle w:val="Encabezado"/>
+      <w:pStyle w:val="Header"/>
     </w:pPr>
     <w:r>
       <w:rPr>
@@ -2394,7 +5959,7 @@
                           <w:sdtContent>
                             <w:p>
                               <w:pPr>
-                                <w:pStyle w:val="Encabezado"/>
+                                <w:pStyle w:val="Header"/>
                                 <w:spacing w:afterAutospacing="0"/>
                                 <w:jc w:val="center"/>
                                 <w:rPr>
@@ -2452,7 +6017,7 @@
                     <w:sdtContent>
                       <w:p>
                         <w:pPr>
-                          <w:pStyle w:val="Encabezado"/>
+                          <w:pStyle w:val="Header"/>
                           <w:spacing w:afterAutospacing="0"/>
                           <w:jc w:val="center"/>
                           <w:rPr>
@@ -2711,6 +6276,119 @@
     </w:lvl>
   </w:abstractNum>
   <w:abstractNum w:abstractNumId="2" w15:restartNumberingAfterBreak="0">
+    <w:nsid w:val="4AE33A78"/>
+    <w:multiLevelType w:val="multilevel"/>
+    <w:tmpl w:val="9F32DEB6"/>
+    <w:lvl w:ilvl="0">
+      <w:start w:val="1"/>
+      <w:numFmt w:val="decimal"/>
+      <w:lvlText w:val="%1."/>
+      <w:lvlJc w:val="left"/>
+      <w:pPr>
+        <w:ind w:left="516" w:hanging="516"/>
+      </w:pPr>
+      <w:rPr>
+        <w:rFonts w:hint="default"/>
+      </w:rPr>
+    </w:lvl>
+    <w:lvl w:ilvl="1">
+      <w:start w:val="1"/>
+      <w:numFmt w:val="decimal"/>
+      <w:lvlText w:val="%1.%2."/>
+      <w:lvlJc w:val="left"/>
+      <w:pPr>
+        <w:ind w:left="720" w:hanging="720"/>
+      </w:pPr>
+      <w:rPr>
+        <w:rFonts w:hint="default"/>
+      </w:rPr>
+    </w:lvl>
+    <w:lvl w:ilvl="2">
+      <w:start w:val="1"/>
+      <w:numFmt w:val="decimal"/>
+      <w:lvlText w:val="%1.%2.%3."/>
+      <w:lvlJc w:val="left"/>
+      <w:pPr>
+        <w:ind w:left="720" w:hanging="720"/>
+      </w:pPr>
+      <w:rPr>
+        <w:rFonts w:hint="default"/>
+      </w:rPr>
+    </w:lvl>
+    <w:lvl w:ilvl="3">
+      <w:start w:val="1"/>
+      <w:numFmt w:val="decimal"/>
+      <w:lvlText w:val="%1.%2.%3.%4."/>
+      <w:lvlJc w:val="left"/>
+      <w:pPr>
+        <w:ind w:left="1080" w:hanging="1080"/>
+      </w:pPr>
+      <w:rPr>
+        <w:rFonts w:hint="default"/>
+      </w:rPr>
+    </w:lvl>
+    <w:lvl w:ilvl="4">
+      <w:start w:val="1"/>
+      <w:numFmt w:val="decimal"/>
+      <w:lvlText w:val="%1.%2.%3.%4.%5."/>
+      <w:lvlJc w:val="left"/>
+      <w:pPr>
+        <w:ind w:left="1080" w:hanging="1080"/>
+      </w:pPr>
+      <w:rPr>
+        <w:rFonts w:hint="default"/>
+      </w:rPr>
+    </w:lvl>
+    <w:lvl w:ilvl="5">
+      <w:start w:val="1"/>
+      <w:numFmt w:val="decimal"/>
+      <w:lvlText w:val="%1.%2.%3.%4.%5.%6."/>
+      <w:lvlJc w:val="left"/>
+      <w:pPr>
+        <w:ind w:left="1440" w:hanging="1440"/>
+      </w:pPr>
+      <w:rPr>
+        <w:rFonts w:hint="default"/>
+      </w:rPr>
+    </w:lvl>
+    <w:lvl w:ilvl="6">
+      <w:start w:val="1"/>
+      <w:numFmt w:val="decimal"/>
+      <w:lvlText w:val="%1.%2.%3.%4.%5.%6.%7."/>
+      <w:lvlJc w:val="left"/>
+      <w:pPr>
+        <w:ind w:left="1800" w:hanging="1800"/>
+      </w:pPr>
+      <w:rPr>
+        <w:rFonts w:hint="default"/>
+      </w:rPr>
+    </w:lvl>
+    <w:lvl w:ilvl="7">
+      <w:start w:val="1"/>
+      <w:numFmt w:val="decimal"/>
+      <w:lvlText w:val="%1.%2.%3.%4.%5.%6.%7.%8."/>
+      <w:lvlJc w:val="left"/>
+      <w:pPr>
+        <w:ind w:left="1800" w:hanging="1800"/>
+      </w:pPr>
+      <w:rPr>
+        <w:rFonts w:hint="default"/>
+      </w:rPr>
+    </w:lvl>
+    <w:lvl w:ilvl="8">
+      <w:start w:val="1"/>
+      <w:numFmt w:val="decimal"/>
+      <w:lvlText w:val="%1.%2.%3.%4.%5.%6.%7.%8.%9."/>
+      <w:lvlJc w:val="left"/>
+      <w:pPr>
+        <w:ind w:left="2160" w:hanging="2160"/>
+      </w:pPr>
+      <w:rPr>
+        <w:rFonts w:hint="default"/>
+      </w:rPr>
+    </w:lvl>
+  </w:abstractNum>
+  <w:abstractNum w:abstractNumId="3" w15:restartNumberingAfterBreak="0">
     <w:nsid w:val="4B2175D7"/>
     <w:multiLevelType w:val="hybridMultilevel"/>
     <w:tmpl w:val="26BA0B6E"/>
@@ -2823,7 +6501,7 @@
       </w:rPr>
     </w:lvl>
   </w:abstractNum>
-  <w:abstractNum w:abstractNumId="3" w15:restartNumberingAfterBreak="0">
+  <w:abstractNum w:abstractNumId="4" w15:restartNumberingAfterBreak="0">
     <w:nsid w:val="6AFF0A6C"/>
     <w:multiLevelType w:val="hybridMultilevel"/>
     <w:tmpl w:val="1D244E56"/>
@@ -2936,7 +6614,7 @@
       </w:rPr>
     </w:lvl>
   </w:abstractNum>
-  <w:abstractNum w:abstractNumId="4" w15:restartNumberingAfterBreak="0">
+  <w:abstractNum w:abstractNumId="5" w15:restartNumberingAfterBreak="0">
     <w:nsid w:val="76AC6F7E"/>
     <w:multiLevelType w:val="hybridMultilevel"/>
     <w:tmpl w:val="E9644394"/>
@@ -3050,19 +6728,22 @@
     </w:lvl>
   </w:abstractNum>
   <w:num w:numId="1" w16cid:durableId="1942955842">
-    <w:abstractNumId w:val="2"/>
+    <w:abstractNumId w:val="3"/>
   </w:num>
   <w:num w:numId="2" w16cid:durableId="684213225">
-    <w:abstractNumId w:val="4"/>
+    <w:abstractNumId w:val="5"/>
   </w:num>
   <w:num w:numId="3" w16cid:durableId="1298028463">
     <w:abstractNumId w:val="0"/>
   </w:num>
   <w:num w:numId="4" w16cid:durableId="968708283">
-    <w:abstractNumId w:val="3"/>
+    <w:abstractNumId w:val="4"/>
   </w:num>
   <w:num w:numId="5" w16cid:durableId="403649129">
     <w:abstractNumId w:val="1"/>
+  </w:num>
+  <w:num w:numId="6" w16cid:durableId="1436050671">
+    <w:abstractNumId w:val="2"/>
   </w:num>
 </w:numbering>
 </file>
@@ -3478,11 +7159,11 @@
       <w14:ligatures w14:val="none"/>
     </w:rPr>
   </w:style>
-  <w:style w:type="paragraph" w:styleId="Ttulo1">
+  <w:style w:type="paragraph" w:styleId="Heading1">
     <w:name w:val="heading 1"/>
     <w:basedOn w:val="Normal"/>
     <w:next w:val="Normal"/>
-    <w:link w:val="Ttulo1Car"/>
+    <w:link w:val="Heading1Char"/>
     <w:uiPriority w:val="9"/>
     <w:qFormat/>
     <w:rsid w:val="00F86B65"/>
@@ -3501,11 +7182,11 @@
       <w14:ligatures w14:val="standardContextual"/>
     </w:rPr>
   </w:style>
-  <w:style w:type="paragraph" w:styleId="Ttulo2">
+  <w:style w:type="paragraph" w:styleId="Heading2">
     <w:name w:val="heading 2"/>
     <w:basedOn w:val="Normal"/>
     <w:next w:val="Normal"/>
-    <w:link w:val="Ttulo2Car"/>
+    <w:link w:val="Heading2Char"/>
     <w:uiPriority w:val="9"/>
     <w:semiHidden/>
     <w:unhideWhenUsed/>
@@ -3526,11 +7207,11 @@
       <w14:ligatures w14:val="standardContextual"/>
     </w:rPr>
   </w:style>
-  <w:style w:type="paragraph" w:styleId="Ttulo3">
+  <w:style w:type="paragraph" w:styleId="Heading3">
     <w:name w:val="heading 3"/>
     <w:basedOn w:val="Normal"/>
     <w:next w:val="Normal"/>
-    <w:link w:val="Ttulo3Car"/>
+    <w:link w:val="Heading3Char"/>
     <w:uiPriority w:val="9"/>
     <w:semiHidden/>
     <w:unhideWhenUsed/>
@@ -3551,11 +7232,11 @@
       <w14:ligatures w14:val="standardContextual"/>
     </w:rPr>
   </w:style>
-  <w:style w:type="paragraph" w:styleId="Ttulo4">
+  <w:style w:type="paragraph" w:styleId="Heading4">
     <w:name w:val="heading 4"/>
     <w:basedOn w:val="Normal"/>
     <w:next w:val="Normal"/>
-    <w:link w:val="Ttulo4Car"/>
+    <w:link w:val="Heading4Char"/>
     <w:uiPriority w:val="9"/>
     <w:semiHidden/>
     <w:unhideWhenUsed/>
@@ -3578,11 +7259,11 @@
       <w14:ligatures w14:val="standardContextual"/>
     </w:rPr>
   </w:style>
-  <w:style w:type="paragraph" w:styleId="Ttulo5">
+  <w:style w:type="paragraph" w:styleId="Heading5">
     <w:name w:val="heading 5"/>
     <w:basedOn w:val="Normal"/>
     <w:next w:val="Normal"/>
-    <w:link w:val="Ttulo5Car"/>
+    <w:link w:val="Heading5Char"/>
     <w:uiPriority w:val="9"/>
     <w:semiHidden/>
     <w:unhideWhenUsed/>
@@ -3603,11 +7284,11 @@
       <w14:ligatures w14:val="standardContextual"/>
     </w:rPr>
   </w:style>
-  <w:style w:type="paragraph" w:styleId="Ttulo6">
+  <w:style w:type="paragraph" w:styleId="Heading6">
     <w:name w:val="heading 6"/>
     <w:basedOn w:val="Normal"/>
     <w:next w:val="Normal"/>
-    <w:link w:val="Ttulo6Car"/>
+    <w:link w:val="Heading6Char"/>
     <w:uiPriority w:val="9"/>
     <w:semiHidden/>
     <w:unhideWhenUsed/>
@@ -3630,11 +7311,11 @@
       <w14:ligatures w14:val="standardContextual"/>
     </w:rPr>
   </w:style>
-  <w:style w:type="paragraph" w:styleId="Ttulo7">
+  <w:style w:type="paragraph" w:styleId="Heading7">
     <w:name w:val="heading 7"/>
     <w:basedOn w:val="Normal"/>
     <w:next w:val="Normal"/>
-    <w:link w:val="Ttulo7Car"/>
+    <w:link w:val="Heading7Char"/>
     <w:uiPriority w:val="9"/>
     <w:semiHidden/>
     <w:unhideWhenUsed/>
@@ -3655,11 +7336,11 @@
       <w14:ligatures w14:val="standardContextual"/>
     </w:rPr>
   </w:style>
-  <w:style w:type="paragraph" w:styleId="Ttulo8">
+  <w:style w:type="paragraph" w:styleId="Heading8">
     <w:name w:val="heading 8"/>
     <w:basedOn w:val="Normal"/>
     <w:next w:val="Normal"/>
-    <w:link w:val="Ttulo8Car"/>
+    <w:link w:val="Heading8Char"/>
     <w:uiPriority w:val="9"/>
     <w:semiHidden/>
     <w:unhideWhenUsed/>
@@ -3682,11 +7363,11 @@
       <w14:ligatures w14:val="standardContextual"/>
     </w:rPr>
   </w:style>
-  <w:style w:type="paragraph" w:styleId="Ttulo9">
+  <w:style w:type="paragraph" w:styleId="Heading9">
     <w:name w:val="heading 9"/>
     <w:basedOn w:val="Normal"/>
     <w:next w:val="Normal"/>
-    <w:link w:val="Ttulo9Car"/>
+    <w:link w:val="Heading9Char"/>
     <w:uiPriority w:val="9"/>
     <w:semiHidden/>
     <w:unhideWhenUsed/>
@@ -3707,12 +7388,13 @@
       <w14:ligatures w14:val="standardContextual"/>
     </w:rPr>
   </w:style>
-  <w:style w:type="character" w:default="1" w:styleId="Fuentedeprrafopredeter">
+  <w:style w:type="character" w:default="1" w:styleId="DefaultParagraphFont">
     <w:name w:val="Default Paragraph Font"/>
     <w:uiPriority w:val="1"/>
+    <w:semiHidden/>
     <w:unhideWhenUsed/>
   </w:style>
-  <w:style w:type="table" w:default="1" w:styleId="Tablanormal">
+  <w:style w:type="table" w:default="1" w:styleId="TableNormal">
     <w:name w:val="Normal Table"/>
     <w:uiPriority w:val="99"/>
     <w:semiHidden/>
@@ -3727,16 +7409,16 @@
       </w:tblCellMar>
     </w:tblPr>
   </w:style>
-  <w:style w:type="numbering" w:default="1" w:styleId="Sinlista">
+  <w:style w:type="numbering" w:default="1" w:styleId="NoList">
     <w:name w:val="No List"/>
     <w:uiPriority w:val="99"/>
     <w:semiHidden/>
     <w:unhideWhenUsed/>
   </w:style>
-  <w:style w:type="character" w:customStyle="1" w:styleId="Ttulo1Car">
-    <w:name w:val="Título 1 Car"/>
-    <w:basedOn w:val="Fuentedeprrafopredeter"/>
-    <w:link w:val="Ttulo1"/>
+  <w:style w:type="character" w:customStyle="1" w:styleId="Heading1Char">
+    <w:name w:val="Heading 1 Char"/>
+    <w:basedOn w:val="DefaultParagraphFont"/>
+    <w:link w:val="Heading1"/>
     <w:uiPriority w:val="9"/>
     <w:rsid w:val="00F86B65"/>
     <w:rPr>
@@ -3746,10 +7428,10 @@
       <w:szCs w:val="40"/>
     </w:rPr>
   </w:style>
-  <w:style w:type="character" w:customStyle="1" w:styleId="Ttulo2Car">
-    <w:name w:val="Título 2 Car"/>
-    <w:basedOn w:val="Fuentedeprrafopredeter"/>
-    <w:link w:val="Ttulo2"/>
+  <w:style w:type="character" w:customStyle="1" w:styleId="Heading2Char">
+    <w:name w:val="Heading 2 Char"/>
+    <w:basedOn w:val="DefaultParagraphFont"/>
+    <w:link w:val="Heading2"/>
     <w:uiPriority w:val="9"/>
     <w:semiHidden/>
     <w:rsid w:val="00F86B65"/>
@@ -3760,10 +7442,10 @@
       <w:szCs w:val="32"/>
     </w:rPr>
   </w:style>
-  <w:style w:type="character" w:customStyle="1" w:styleId="Ttulo3Car">
-    <w:name w:val="Título 3 Car"/>
-    <w:basedOn w:val="Fuentedeprrafopredeter"/>
-    <w:link w:val="Ttulo3"/>
+  <w:style w:type="character" w:customStyle="1" w:styleId="Heading3Char">
+    <w:name w:val="Heading 3 Char"/>
+    <w:basedOn w:val="DefaultParagraphFont"/>
+    <w:link w:val="Heading3"/>
     <w:uiPriority w:val="9"/>
     <w:semiHidden/>
     <w:rsid w:val="00F86B65"/>
@@ -3774,10 +7456,10 @@
       <w:szCs w:val="28"/>
     </w:rPr>
   </w:style>
-  <w:style w:type="character" w:customStyle="1" w:styleId="Ttulo4Car">
-    <w:name w:val="Título 4 Car"/>
-    <w:basedOn w:val="Fuentedeprrafopredeter"/>
-    <w:link w:val="Ttulo4"/>
+  <w:style w:type="character" w:customStyle="1" w:styleId="Heading4Char">
+    <w:name w:val="Heading 4 Char"/>
+    <w:basedOn w:val="DefaultParagraphFont"/>
+    <w:link w:val="Heading4"/>
     <w:uiPriority w:val="9"/>
     <w:semiHidden/>
     <w:rsid w:val="00F86B65"/>
@@ -3788,10 +7470,10 @@
       <w:color w:val="0F4761" w:themeColor="accent1" w:themeShade="BF"/>
     </w:rPr>
   </w:style>
-  <w:style w:type="character" w:customStyle="1" w:styleId="Ttulo5Car">
-    <w:name w:val="Título 5 Car"/>
-    <w:basedOn w:val="Fuentedeprrafopredeter"/>
-    <w:link w:val="Ttulo5"/>
+  <w:style w:type="character" w:customStyle="1" w:styleId="Heading5Char">
+    <w:name w:val="Heading 5 Char"/>
+    <w:basedOn w:val="DefaultParagraphFont"/>
+    <w:link w:val="Heading5"/>
     <w:uiPriority w:val="9"/>
     <w:semiHidden/>
     <w:rsid w:val="00F86B65"/>
@@ -3800,10 +7482,10 @@
       <w:color w:val="0F4761" w:themeColor="accent1" w:themeShade="BF"/>
     </w:rPr>
   </w:style>
-  <w:style w:type="character" w:customStyle="1" w:styleId="Ttulo6Car">
-    <w:name w:val="Título 6 Car"/>
-    <w:basedOn w:val="Fuentedeprrafopredeter"/>
-    <w:link w:val="Ttulo6"/>
+  <w:style w:type="character" w:customStyle="1" w:styleId="Heading6Char">
+    <w:name w:val="Heading 6 Char"/>
+    <w:basedOn w:val="DefaultParagraphFont"/>
+    <w:link w:val="Heading6"/>
     <w:uiPriority w:val="9"/>
     <w:semiHidden/>
     <w:rsid w:val="00F86B65"/>
@@ -3814,10 +7496,10 @@
       <w:color w:val="595959" w:themeColor="text1" w:themeTint="A6"/>
     </w:rPr>
   </w:style>
-  <w:style w:type="character" w:customStyle="1" w:styleId="Ttulo7Car">
-    <w:name w:val="Título 7 Car"/>
-    <w:basedOn w:val="Fuentedeprrafopredeter"/>
-    <w:link w:val="Ttulo7"/>
+  <w:style w:type="character" w:customStyle="1" w:styleId="Heading7Char">
+    <w:name w:val="Heading 7 Char"/>
+    <w:basedOn w:val="DefaultParagraphFont"/>
+    <w:link w:val="Heading7"/>
     <w:uiPriority w:val="9"/>
     <w:semiHidden/>
     <w:rsid w:val="00F86B65"/>
@@ -3826,10 +7508,10 @@
       <w:color w:val="595959" w:themeColor="text1" w:themeTint="A6"/>
     </w:rPr>
   </w:style>
-  <w:style w:type="character" w:customStyle="1" w:styleId="Ttulo8Car">
-    <w:name w:val="Título 8 Car"/>
-    <w:basedOn w:val="Fuentedeprrafopredeter"/>
-    <w:link w:val="Ttulo8"/>
+  <w:style w:type="character" w:customStyle="1" w:styleId="Heading8Char">
+    <w:name w:val="Heading 8 Char"/>
+    <w:basedOn w:val="DefaultParagraphFont"/>
+    <w:link w:val="Heading8"/>
     <w:uiPriority w:val="9"/>
     <w:semiHidden/>
     <w:rsid w:val="00F86B65"/>
@@ -3840,10 +7522,10 @@
       <w:color w:val="272727" w:themeColor="text1" w:themeTint="D8"/>
     </w:rPr>
   </w:style>
-  <w:style w:type="character" w:customStyle="1" w:styleId="Ttulo9Car">
-    <w:name w:val="Título 9 Car"/>
-    <w:basedOn w:val="Fuentedeprrafopredeter"/>
-    <w:link w:val="Ttulo9"/>
+  <w:style w:type="character" w:customStyle="1" w:styleId="Heading9Char">
+    <w:name w:val="Heading 9 Char"/>
+    <w:basedOn w:val="DefaultParagraphFont"/>
+    <w:link w:val="Heading9"/>
     <w:uiPriority w:val="9"/>
     <w:semiHidden/>
     <w:rsid w:val="00F86B65"/>
@@ -3852,11 +7534,11 @@
       <w:color w:val="272727" w:themeColor="text1" w:themeTint="D8"/>
     </w:rPr>
   </w:style>
-  <w:style w:type="paragraph" w:styleId="Ttulo">
+  <w:style w:type="paragraph" w:styleId="Title">
     <w:name w:val="Title"/>
     <w:basedOn w:val="Normal"/>
     <w:next w:val="Normal"/>
-    <w:link w:val="TtuloCar"/>
+    <w:link w:val="TitleChar"/>
     <w:uiPriority w:val="10"/>
     <w:qFormat/>
     <w:rsid w:val="00F86B65"/>
@@ -3873,10 +7555,10 @@
       <w14:ligatures w14:val="standardContextual"/>
     </w:rPr>
   </w:style>
-  <w:style w:type="character" w:customStyle="1" w:styleId="TtuloCar">
-    <w:name w:val="Título Car"/>
-    <w:basedOn w:val="Fuentedeprrafopredeter"/>
-    <w:link w:val="Ttulo"/>
+  <w:style w:type="character" w:customStyle="1" w:styleId="TitleChar">
+    <w:name w:val="Title Char"/>
+    <w:basedOn w:val="DefaultParagraphFont"/>
+    <w:link w:val="Title"/>
     <w:uiPriority w:val="10"/>
     <w:rsid w:val="00F86B65"/>
     <w:rPr>
@@ -3887,11 +7569,11 @@
       <w:szCs w:val="56"/>
     </w:rPr>
   </w:style>
-  <w:style w:type="paragraph" w:styleId="Subttulo">
+  <w:style w:type="paragraph" w:styleId="Subtitle">
     <w:name w:val="Subtitle"/>
     <w:basedOn w:val="Normal"/>
     <w:next w:val="Normal"/>
-    <w:link w:val="SubttuloCar"/>
+    <w:link w:val="SubtitleChar"/>
     <w:uiPriority w:val="11"/>
     <w:qFormat/>
     <w:rsid w:val="00F86B65"/>
@@ -3911,10 +7593,10 @@
       <w14:ligatures w14:val="standardContextual"/>
     </w:rPr>
   </w:style>
-  <w:style w:type="character" w:customStyle="1" w:styleId="SubttuloCar">
-    <w:name w:val="Subtítulo Car"/>
-    <w:basedOn w:val="Fuentedeprrafopredeter"/>
-    <w:link w:val="Subttulo"/>
+  <w:style w:type="character" w:customStyle="1" w:styleId="SubtitleChar">
+    <w:name w:val="Subtitle Char"/>
+    <w:basedOn w:val="DefaultParagraphFont"/>
+    <w:link w:val="Subtitle"/>
     <w:uiPriority w:val="11"/>
     <w:rsid w:val="00F86B65"/>
     <w:rPr>
@@ -3925,11 +7607,11 @@
       <w:szCs w:val="28"/>
     </w:rPr>
   </w:style>
-  <w:style w:type="paragraph" w:styleId="Cita">
+  <w:style w:type="paragraph" w:styleId="Quote">
     <w:name w:val="Quote"/>
     <w:basedOn w:val="Normal"/>
     <w:next w:val="Normal"/>
-    <w:link w:val="CitaCar"/>
+    <w:link w:val="QuoteChar"/>
     <w:uiPriority w:val="29"/>
     <w:qFormat/>
     <w:rsid w:val="00F86B65"/>
@@ -3947,10 +7629,10 @@
       <w14:ligatures w14:val="standardContextual"/>
     </w:rPr>
   </w:style>
-  <w:style w:type="character" w:customStyle="1" w:styleId="CitaCar">
-    <w:name w:val="Cita Car"/>
-    <w:basedOn w:val="Fuentedeprrafopredeter"/>
-    <w:link w:val="Cita"/>
+  <w:style w:type="character" w:customStyle="1" w:styleId="QuoteChar">
+    <w:name w:val="Quote Char"/>
+    <w:basedOn w:val="DefaultParagraphFont"/>
+    <w:link w:val="Quote"/>
     <w:uiPriority w:val="29"/>
     <w:rsid w:val="00F86B65"/>
     <w:rPr>
@@ -3959,7 +7641,7 @@
       <w:color w:val="404040" w:themeColor="text1" w:themeTint="BF"/>
     </w:rPr>
   </w:style>
-  <w:style w:type="paragraph" w:styleId="Prrafodelista">
+  <w:style w:type="paragraph" w:styleId="ListParagraph">
     <w:name w:val="List Paragraph"/>
     <w:basedOn w:val="Normal"/>
     <w:uiPriority w:val="34"/>
@@ -3977,9 +7659,9 @@
       <w14:ligatures w14:val="standardContextual"/>
     </w:rPr>
   </w:style>
-  <w:style w:type="character" w:styleId="nfasisintenso">
+  <w:style w:type="character" w:styleId="IntenseEmphasis">
     <w:name w:val="Intense Emphasis"/>
-    <w:basedOn w:val="Fuentedeprrafopredeter"/>
+    <w:basedOn w:val="DefaultParagraphFont"/>
     <w:uiPriority w:val="21"/>
     <w:qFormat/>
     <w:rsid w:val="00F86B65"/>
@@ -3989,11 +7671,11 @@
       <w:color w:val="0F4761" w:themeColor="accent1" w:themeShade="BF"/>
     </w:rPr>
   </w:style>
-  <w:style w:type="paragraph" w:styleId="Citadestacada">
+  <w:style w:type="paragraph" w:styleId="IntenseQuote">
     <w:name w:val="Intense Quote"/>
     <w:basedOn w:val="Normal"/>
     <w:next w:val="Normal"/>
-    <w:link w:val="CitadestacadaCar"/>
+    <w:link w:val="IntenseQuoteChar"/>
     <w:uiPriority w:val="30"/>
     <w:qFormat/>
     <w:rsid w:val="00F86B65"/>
@@ -4016,10 +7698,10 @@
       <w14:ligatures w14:val="standardContextual"/>
     </w:rPr>
   </w:style>
-  <w:style w:type="character" w:customStyle="1" w:styleId="CitadestacadaCar">
-    <w:name w:val="Cita destacada Car"/>
-    <w:basedOn w:val="Fuentedeprrafopredeter"/>
-    <w:link w:val="Citadestacada"/>
+  <w:style w:type="character" w:customStyle="1" w:styleId="IntenseQuoteChar">
+    <w:name w:val="Intense Quote Char"/>
+    <w:basedOn w:val="DefaultParagraphFont"/>
+    <w:link w:val="IntenseQuote"/>
     <w:uiPriority w:val="30"/>
     <w:rsid w:val="00F86B65"/>
     <w:rPr>
@@ -4028,9 +7710,9 @@
       <w:color w:val="0F4761" w:themeColor="accent1" w:themeShade="BF"/>
     </w:rPr>
   </w:style>
-  <w:style w:type="character" w:styleId="Referenciaintensa">
+  <w:style w:type="character" w:styleId="IntenseReference">
     <w:name w:val="Intense Reference"/>
-    <w:basedOn w:val="Fuentedeprrafopredeter"/>
+    <w:basedOn w:val="DefaultParagraphFont"/>
     <w:uiPriority w:val="32"/>
     <w:qFormat/>
     <w:rsid w:val="00F86B65"/>
@@ -4042,9 +7724,9 @@
       <w:spacing w:val="5"/>
     </w:rPr>
   </w:style>
-  <w:style w:type="table" w:styleId="Tablaconcuadrcula">
+  <w:style w:type="table" w:styleId="TableGrid">
     <w:name w:val="Table Grid"/>
-    <w:basedOn w:val="Tablanormal"/>
+    <w:basedOn w:val="TableNormal"/>
     <w:uiPriority w:val="59"/>
     <w:rsid w:val="00F86B65"/>
     <w:pPr>
@@ -4068,10 +7750,10 @@
       </w:tblBorders>
     </w:tblPr>
   </w:style>
-  <w:style w:type="paragraph" w:styleId="Encabezado">
+  <w:style w:type="paragraph" w:styleId="Header">
     <w:name w:val="header"/>
     <w:basedOn w:val="Normal"/>
-    <w:link w:val="EncabezadoCar"/>
+    <w:link w:val="HeaderChar"/>
     <w:uiPriority w:val="99"/>
     <w:unhideWhenUsed/>
     <w:rsid w:val="00F86B65"/>
@@ -4083,10 +7765,10 @@
       <w:spacing w:after="0" w:line="240" w:lineRule="auto"/>
     </w:pPr>
   </w:style>
-  <w:style w:type="character" w:customStyle="1" w:styleId="EncabezadoCar">
-    <w:name w:val="Encabezado Car"/>
-    <w:basedOn w:val="Fuentedeprrafopredeter"/>
-    <w:link w:val="Encabezado"/>
+  <w:style w:type="character" w:customStyle="1" w:styleId="HeaderChar">
+    <w:name w:val="Header Char"/>
+    <w:basedOn w:val="DefaultParagraphFont"/>
+    <w:link w:val="Header"/>
     <w:uiPriority w:val="99"/>
     <w:rsid w:val="00F86B65"/>
     <w:rPr>
@@ -4097,10 +7779,10 @@
       <w14:ligatures w14:val="none"/>
     </w:rPr>
   </w:style>
-  <w:style w:type="paragraph" w:styleId="Piedepgina">
+  <w:style w:type="paragraph" w:styleId="Footer">
     <w:name w:val="footer"/>
     <w:basedOn w:val="Normal"/>
-    <w:link w:val="PiedepginaCar"/>
+    <w:link w:val="FooterChar"/>
     <w:uiPriority w:val="99"/>
     <w:unhideWhenUsed/>
     <w:rsid w:val="00F86B65"/>
@@ -4112,10 +7794,10 @@
       <w:spacing w:after="0" w:line="240" w:lineRule="auto"/>
     </w:pPr>
   </w:style>
-  <w:style w:type="character" w:customStyle="1" w:styleId="PiedepginaCar">
-    <w:name w:val="Pie de página Car"/>
-    <w:basedOn w:val="Fuentedeprrafopredeter"/>
-    <w:link w:val="Piedepgina"/>
+  <w:style w:type="character" w:customStyle="1" w:styleId="FooterChar">
+    <w:name w:val="Footer Char"/>
+    <w:basedOn w:val="DefaultParagraphFont"/>
+    <w:link w:val="Footer"/>
     <w:uiPriority w:val="99"/>
     <w:rsid w:val="00F86B65"/>
     <w:rPr>

</xml_diff>